<commit_message>
Validate on real PRIDE/MassIVE-KB data and update manuscript
Target-decoy search of PRIDE-derived BSA runs, simulator calibration against
real HCD/CID fragmentation statistics, sim-to-real de novo transfer with
calibrated fine-tuning and bootstrap CIs, real MS1 identification-bottleneck
analysis, Fig. 7 and Tables 9-11.

Co-Authored-By: Claude Opus 5.5 <noreply@anthropic.com>
Claude-Session: https://claude.ai/code/session_01Gyrw1mxtz2ubpdBpSdibdj
</commit_message>
<xml_diff>
--- a/spectrum_native_proteomics/paper/manuscript.docx
+++ b/spectrum_native_proteomics/paper/manuscript.docx
@@ -94,7 +94,43 @@
         <w:rPr>
           <w:color w:val="1F2A44"/>
         </w:rPr>
-        <w:t xml:space="preserve">benchmark</w:t>
+        <w:t xml:space="preserve">benchmark,</w:t>
+      </w:r>
+      <w:r>
+        <w:rPr>
+          <w:color w:val="1F2A44"/>
+        </w:rPr>
+        <w:t xml:space="preserve"> </w:t>
+      </w:r>
+      <w:r>
+        <w:rPr>
+          <w:color w:val="1F2A44"/>
+        </w:rPr>
+        <w:t xml:space="preserve">with</w:t>
+      </w:r>
+      <w:r>
+        <w:rPr>
+          <w:color w:val="1F2A44"/>
+        </w:rPr>
+        <w:t xml:space="preserve"> </w:t>
+      </w:r>
+      <w:r>
+        <w:rPr>
+          <w:color w:val="1F2A44"/>
+        </w:rPr>
+        <w:t xml:space="preserve">real-data</w:t>
+      </w:r>
+      <w:r>
+        <w:rPr>
+          <w:color w:val="1F2A44"/>
+        </w:rPr>
+        <w:t xml:space="preserve"> </w:t>
+      </w:r>
+      <w:r>
+        <w:rPr>
+          <w:color w:val="1F2A44"/>
+        </w:rPr>
+        <w:t xml:space="preserve">validation,</w:t>
       </w:r>
       <w:r>
         <w:rPr>
@@ -468,6 +504,14 @@
         <w:pStyle w:val="BodyText"/>
       </w:pPr>
       <w:r>
+        <w:t xml:space="preserve">We validated the benchmark on real data: PRIDE-derived LC-MS/MS runs (3,135 MS2 spectra) and 119 annotated MassIVE-KB spectra. Real HCD spectra were more y-dominated than the default simulator (b-ion observation 0.29 vs 0.78). On real runs only 0.19 % of 25,613 MS1 features were identified at 1 % FDR, and 1,342 features had complete identification-free profiles against one with identification-first quantification. Applied zero-shot to real spectra, SpecNovo recalled 7.6 % of peptides. After fine-tuning on simulation calibrated to the measured fragmentation statistics it recalled 15.1 % (95 % CI 9.2–21.8 %), with precision–coverage AUC equal to the spectrum-graph baseline (0.352 vs 0.346).</w:t>
+      </w:r>
+    </w:p>
+    <w:p>
+      <w:pPr>
+        <w:pStyle w:val="BodyText"/>
+      </w:pPr>
+      <w:r>
         <w:rPr>
           <w:bCs/>
           <w:b/>
@@ -478,7 +522,7 @@
         <w:t xml:space="preserve"> </w:t>
       </w:r>
       <w:r>
-        <w:t xml:space="preserve">Spectrum-native learning recovers information that identification-first pipelines lose, especially for variant, novel and dark-proteome signal. At realistic data scales, though, its benefits depend strongly on physics-informed inductive biases and on corpus size. The benchmark, code and all measurements are released to support</w:t>
+        <w:t xml:space="preserve">Spectrum-native learning recovers information that identification-first pipelines lose, especially for variant, novel and dark-proteome signal. At realistic data scales, though, its benefits depend strongly on physics-informed inductive biases and on corpus size. Real-data validation confirms the identification bottleneck and shows that simulator calibration is necessary for learned models to transfer. The benchmark, code and all measurements are released to support</w:t>
       </w:r>
       <w:r>
         <w:t xml:space="preserve"> </w:t>
@@ -593,6 +637,18 @@
         <w:pStyle w:val="Compact"/>
       </w:pPr>
       <w:r>
+        <w:t xml:space="preserve">Real PRIDE and MassIVE-KB data confirm the bottleneck (0.19 % of MS1 features identified). They also show that calibrating the simulator to measured b/y statistics doubles real-spectrum de novo recall of the learned model.</w:t>
+      </w:r>
+    </w:p>
+    <w:p>
+      <w:pPr>
+        <w:numPr>
+          <w:ilvl w:val="0"/>
+          <w:numId w:val="1001"/>
+        </w:numPr>
+        <w:pStyle w:val="Compact"/>
+      </w:pPr>
+      <w:r>
         <w:t xml:space="preserve">At cohort sizes of 24–384 samples, linear models on identification-free features outperform ProFormer-style transformers; self-supervised pretraining chiefly improves cross-site robustness — a quantitative argument for corpus-scale (MassNet-style) pretraining.</w:t>
       </w:r>
     </w:p>
@@ -811,7 +867,6 @@
           <w:ilvl w:val="0"/>
           <w:numId w:val="1002"/>
         </w:numPr>
-        <w:pStyle w:val="Compact"/>
       </w:pPr>
       <w:r>
         <w:rPr>
@@ -849,7 +904,6 @@
           <w:ilvl w:val="0"/>
           <w:numId w:val="1002"/>
         </w:numPr>
-        <w:pStyle w:val="Compact"/>
       </w:pPr>
       <w:r>
         <w:rPr>
@@ -868,7 +922,6 @@
           <w:ilvl w:val="0"/>
           <w:numId w:val="1002"/>
         </w:numPr>
-        <w:pStyle w:val="Compact"/>
       </w:pPr>
       <w:r>
         <w:rPr>
@@ -905,7 +958,6 @@
           <w:ilvl w:val="0"/>
           <w:numId w:val="1002"/>
         </w:numPr>
-        <w:pStyle w:val="Compact"/>
       </w:pPr>
       <w:r>
         <w:rPr>
@@ -920,6 +972,27 @@
     </w:p>
     <w:p>
       <w:pPr>
+        <w:numPr>
+          <w:ilvl w:val="0"/>
+          <w:numId w:val="1002"/>
+        </w:numPr>
+      </w:pPr>
+      <w:r>
+        <w:rPr>
+          <w:bCs/>
+          <w:b/>
+        </w:rPr>
+        <w:t xml:space="preserve">Real-data validation</w:t>
+      </w:r>
+      <w:r>
+        <w:t xml:space="preserve"> </w:t>
+      </w:r>
+      <w:r>
+        <w:t xml:space="preserve">on PRIDE-derived LC-MS/MS runs and MassIVE-KB annotated spectra. It comprises simulator calibration against measured fragmentation statistics, a sim-to-real transfer test of de novo sequencing with calibrated fine-tuning, and a measurement of the identification bottleneck on real MS1 features.</w:t>
+      </w:r>
+    </w:p>
+    <w:p>
+      <w:pPr>
         <w:pStyle w:val="FirstParagraph"/>
       </w:pPr>
       <w:r>
@@ -927,7 +1000,7 @@
       </w:r>
     </w:p>
     <w:bookmarkEnd w:id="22"/>
-    <w:bookmarkStart w:id="27" w:name="materials-and-methods"/>
+    <w:bookmarkStart w:id="28" w:name="materials-and-methods"/>
     <w:p>
       <w:pPr>
         <w:pStyle w:val="Heading1"/>
@@ -1898,8 +1971,458 @@
       </w:r>
     </w:p>
     <w:bookmarkEnd w:id="26"/>
+    <w:bookmarkStart w:id="27" w:name="validation-on-real-data"/>
+    <w:p>
+      <w:pPr>
+        <w:pStyle w:val="Heading2"/>
+      </w:pPr>
+      <w:r>
+        <w:rPr>
+          <w:color w:val="1F2A44"/>
+        </w:rPr>
+        <w:t xml:space="preserve">Validation on real data</w:t>
+      </w:r>
+    </w:p>
+    <w:p>
+      <w:pPr>
+        <w:pStyle w:val="FirstParagraph"/>
+      </w:pPr>
+      <w:r>
+        <w:t xml:space="preserve">Direct access to the PRIDE archive servers was not available from the compute environment, so real data were obtained from public mirrors of PRIDE- and MassIVE-derived files.</w:t>
+      </w:r>
+    </w:p>
+    <w:p>
+      <w:pPr>
+        <w:pStyle w:val="BodyText"/>
+      </w:pPr>
+      <w:r>
+        <w:rPr>
+          <w:bCs/>
+          <w:b/>
+        </w:rPr>
+        <w:t xml:space="preserve">PRIDE-derived LC-MS/MS runs.</w:t>
+      </w:r>
+      <w:r>
+        <w:t xml:space="preserve"> </w:t>
+      </w:r>
+      <w:r>
+        <w:t xml:space="preserve">We used the BSA quality-control runs that the PRIDE/bigbio team distributes as continuous-integration data for the quantms reanalysis pipeline [31] (github.com/bigbio/quantms-test-datasets,</w:t>
+      </w:r>
+      <w:r>
+        <w:t xml:space="preserve"> </w:t>
+      </w:r>
+      <w:r>
+        <w:rPr>
+          <w:rStyle w:val="VerbatimChar"/>
+        </w:rPr>
+        <w:t xml:space="preserve">testdata/lfq_ci/BSA</w:t>
+      </w:r>
+      <w:r>
+        <w:t xml:space="preserve">). The set comprises three BSA samples acquired on an LTQ Orbitrap Velos in data-dependent mode, with Orbitrap MS1 and ion-trap CID MS2. Each sample is split in retention time into two mzML files, giving 3,135 MS2 and 1,676 MS1 spectra in total. Sample metadata are provided in SDRF format [32]. They were searched against the supplied 9,439-protein database (18 target proteins, a</w:t>
+      </w:r>
+      <w:r>
+        <w:t xml:space="preserve"> </w:t>
+      </w:r>
+      <w:r>
+        <w:rPr>
+          <w:iCs/>
+          <w:i/>
+        </w:rPr>
+        <w:t xml:space="preserve">Sorangium cellulosum</w:t>
+      </w:r>
+      <w:r>
+        <w:t xml:space="preserve"> </w:t>
+      </w:r>
+      <w:r>
+        <w:t xml:space="preserve">background proteome and contaminants): tryptic, ≤ 2 missed cleavages, 7–30 residues, fixed carbamidomethyl-Cys, variable Met oxidation, 10 ppm precursor tolerance with ±1 isotope error, and reversed decoys (1.73 M target + decoy entries).</w:t>
+      </w:r>
+    </w:p>
+    <w:p>
+      <w:pPr>
+        <w:pStyle w:val="BodyText"/>
+      </w:pPr>
+      <w:r>
+        <w:t xml:space="preserve">The hyperscore used for the simulated HCD data separated targets from decoys poorly on low-resolution CID spectra. We therefore adopted an Andromeda-style binomial score [33]: peaks were filtered to the top</w:t>
+      </w:r>
+      <w:r>
+        <w:t xml:space="preserve"> </w:t>
+      </w:r>
+      <w:r>
+        <w:rPr>
+          <w:iCs/>
+          <w:i/>
+        </w:rPr>
+        <w:t xml:space="preserve">q</w:t>
+      </w:r>
+      <w:r>
+        <w:t xml:space="preserve"> </w:t>
+      </w:r>
+      <w:r>
+        <w:t xml:space="preserve">per 100 m/z (</w:t>
+      </w:r>
+      <w:r>
+        <w:rPr>
+          <w:iCs/>
+          <w:i/>
+        </w:rPr>
+        <w:t xml:space="preserve">q</w:t>
+      </w:r>
+      <w:r>
+        <w:t xml:space="preserve"> </w:t>
+      </w:r>
+      <w:r>
+        <w:t xml:space="preserve">∈ {4, 8, 12}, best</w:t>
+      </w:r>
+      <w:r>
+        <w:t xml:space="preserve"> </w:t>
+      </w:r>
+      <w:r>
+        <w:rPr>
+          <w:iCs/>
+          <w:i/>
+        </w:rPr>
+        <w:t xml:space="preserve">q</w:t>
+      </w:r>
+      <w:r>
+        <w:t xml:space="preserve"> </w:t>
+      </w:r>
+      <w:r>
+        <w:t xml:space="preserve">retained);</w:t>
+      </w:r>
+      <w:r>
+        <w:t xml:space="preserve"> </w:t>
+      </w:r>
+      <w:r>
+        <w:rPr>
+          <w:iCs/>
+          <w:i/>
+        </w:rPr>
+        <w:t xml:space="preserve">k</w:t>
+      </w:r>
+      <w:r>
+        <w:t xml:space="preserve"> </w:t>
+      </w:r>
+      <w:r>
+        <w:t xml:space="preserve">of</w:t>
+      </w:r>
+      <w:r>
+        <w:t xml:space="preserve"> </w:t>
+      </w:r>
+      <w:r>
+        <w:rPr>
+          <w:iCs/>
+          <w:i/>
+        </w:rPr>
+        <w:t xml:space="preserve">n</w:t>
+      </w:r>
+      <w:r>
+        <w:t xml:space="preserve"> </w:t>
+      </w:r>
+      <w:r>
+        <w:t xml:space="preserve">theoretical b/y ions (plus doubly charged ions for</w:t>
+      </w:r>
+      <w:r>
+        <w:t xml:space="preserve"> </w:t>
+      </w:r>
+      <w:r>
+        <w:rPr>
+          <w:iCs/>
+          <w:i/>
+        </w:rPr>
+        <w:t xml:space="preserve">z</w:t>
+      </w:r>
+      <w:r>
+        <w:t xml:space="preserve"> </w:t>
+      </w:r>
+      <w:r>
+        <w:t xml:space="preserve">≥ 3) were matched within 0.4 Da; and</w:t>
+      </w:r>
+      <w:r>
+        <w:t xml:space="preserve"> </w:t>
+      </w:r>
+      <w:r>
+        <w:rPr>
+          <w:iCs/>
+          <w:i/>
+        </w:rPr>
+        <w:t xml:space="preserve">S</w:t>
+      </w:r>
+      <w:r>
+        <w:t xml:space="preserve"> </w:t>
+      </w:r>
+      <w:r>
+        <w:t xml:space="preserve">= −log₁₀ P(X ≥</w:t>
+      </w:r>
+      <w:r>
+        <w:t xml:space="preserve"> </w:t>
+      </w:r>
+      <w:r>
+        <w:rPr>
+          <w:iCs/>
+          <w:i/>
+        </w:rPr>
+        <w:t xml:space="preserve">k</w:t>
+      </w:r>
+      <w:r>
+        <w:t xml:space="preserve">), with X ∼ Binomial(</w:t>
+      </w:r>
+      <w:r>
+        <w:rPr>
+          <w:iCs/>
+          <w:i/>
+        </w:rPr>
+        <w:t xml:space="preserve">n</w:t>
+      </w:r>
+      <w:r>
+        <w:t xml:space="preserve">,</w:t>
+      </w:r>
+      <w:r>
+        <w:t xml:space="preserve"> </w:t>
+      </w:r>
+      <w:r>
+        <w:rPr>
+          <w:iCs/>
+          <w:i/>
+        </w:rPr>
+        <w:t xml:space="preserve">p</w:t>
+      </w:r>
+      <w:r>
+        <w:t xml:space="preserve"> </w:t>
+      </w:r>
+      <w:r>
+        <w:t xml:space="preserve">= 2·0.4·</w:t>
+      </w:r>
+      <w:r>
+        <w:rPr>
+          <w:iCs/>
+          <w:i/>
+        </w:rPr>
+        <w:t xml:space="preserve">q</w:t>
+      </w:r>
+      <w:r>
+        <w:t xml:space="preserve">/100). PSMs were accepted at 1 % FDR (decoy/target ratio after target–decoy competition).</w:t>
+      </w:r>
+    </w:p>
+    <w:p>
+      <w:pPr>
+        <w:pStyle w:val="BodyText"/>
+      </w:pPr>
+      <w:r>
+        <w:rPr>
+          <w:bCs/>
+          <w:b/>
+        </w:rPr>
+        <w:t xml:space="preserve">MassIVE-KB annotated spectra.</w:t>
+      </w:r>
+      <w:r>
+        <w:t xml:space="preserve"> </w:t>
+      </w:r>
+      <w:r>
+        <w:t xml:space="preserve">The 128 annotated high-resolution HCD spectra distributed with Casanovo [9] (</w:t>
+      </w:r>
+      <w:r>
+        <w:rPr>
+          <w:rStyle w:val="VerbatimChar"/>
+        </w:rPr>
+        <w:t xml:space="preserve">sample_data/sample_preprocessed_spectra.mgf</w:t>
+      </w:r>
+      <w:r>
+        <w:t xml:space="preserve">), drawn from MassIVE-KB [7], served as an independent ground-truth set. We retained the 119 spectra with supported modifications (carbamidomethyl-Cys, oxidised Met), length 6–14 and charge 2–3.</w:t>
+      </w:r>
+    </w:p>
+    <w:p>
+      <w:pPr>
+        <w:pStyle w:val="BodyText"/>
+      </w:pPr>
+      <w:r>
+        <w:rPr>
+          <w:bCs/>
+          <w:b/>
+        </w:rPr>
+        <w:t xml:space="preserve">Simulator calibration.</w:t>
+      </w:r>
+      <w:r>
+        <w:t xml:space="preserve"> </w:t>
+      </w:r>
+      <w:r>
+        <w:t xml:space="preserve">On both real sets and on 500 simulated spectra we measured, per PSM:</w:t>
+      </w:r>
+      <w:r>
+        <w:t xml:space="preserve"> </w:t>
+      </w:r>
+      <w:r>
+        <w:t xml:space="preserve">- b- and y-ion observation rates;</w:t>
+      </w:r>
+      <w:r>
+        <w:t xml:space="preserve"> </w:t>
+      </w:r>
+      <w:r>
+        <w:t xml:space="preserve">- summed y/b intensity ratio;</w:t>
+      </w:r>
+      <w:r>
+        <w:t xml:space="preserve"> </w:t>
+      </w:r>
+      <w:r>
+        <w:t xml:space="preserve">- intensity enhancement of cleavage N-terminal to Pro;</w:t>
+      </w:r>
+      <w:r>
+        <w:t xml:space="preserve"> </w:t>
+      </w:r>
+      <w:r>
+        <w:t xml:space="preserve">- fraction of total ion current explained by b/y ions, their neutral losses and doubly charged forms;</w:t>
+      </w:r>
+      <w:r>
+        <w:t xml:space="preserve"> </w:t>
+      </w:r>
+      <w:r>
+        <w:t xml:space="preserve">- number of unexplained peaks;</w:t>
+      </w:r>
+      <w:r>
+        <w:t xml:space="preserve"> </w:t>
+      </w:r>
+      <w:r>
+        <w:t xml:space="preserve">- fragment mass error.</w:t>
+      </w:r>
+    </w:p>
+    <w:p>
+      <w:pPr>
+        <w:pStyle w:val="BodyText"/>
+      </w:pPr>
+      <w:r>
+        <w:t xml:space="preserve">Tolerances were 20 ppm for HCD and 0.4 Da for CID. We then re-simulated a</w:t>
+      </w:r>
+      <w:r>
+        <w:t xml:space="preserve"> </w:t>
+      </w:r>
+      <w:r>
+        <w:rPr>
+          <w:iCs/>
+          <w:i/>
+        </w:rPr>
+        <w:t xml:space="preserve">calibrated</w:t>
+      </w:r>
+      <w:r>
+        <w:t xml:space="preserve"> </w:t>
+      </w:r>
+      <w:r>
+        <w:t xml:space="preserve">corpus of 80,000 spectra (proteome T, peptides 6–14 residues) with</w:t>
+      </w:r>
+      <w:r>
+        <w:t xml:space="preserve"> </w:t>
+      </w:r>
+      <w:r>
+        <w:rPr>
+          <w:iCs/>
+          <w:i/>
+        </w:rPr>
+        <w:t xml:space="preserve">p</w:t>
+      </w:r>
+      <w:r>
+        <w:rPr>
+          <w:vertAlign w:val="subscript"/>
+        </w:rPr>
+        <w:t xml:space="preserve">obs,b</w:t>
+      </w:r>
+      <w:r>
+        <w:t xml:space="preserve"> </w:t>
+      </w:r>
+      <w:r>
+        <w:t xml:space="preserve">∼ U(0.1, 0.6),</w:t>
+      </w:r>
+      <w:r>
+        <w:t xml:space="preserve"> </w:t>
+      </w:r>
+      <w:r>
+        <w:rPr>
+          <w:iCs/>
+          <w:i/>
+        </w:rPr>
+        <w:t xml:space="preserve">p</w:t>
+      </w:r>
+      <w:r>
+        <w:rPr>
+          <w:vertAlign w:val="subscript"/>
+        </w:rPr>
+        <w:t xml:space="preserve">obs,y</w:t>
+      </w:r>
+      <w:r>
+        <w:t xml:space="preserve"> </w:t>
+      </w:r>
+      <w:r>
+        <w:t xml:space="preserve">∼ U(0.4, 0.95), b/y intensity factor ∼ U(0.2, 0.6), 20–80 noise peaks, ≈ 10 low-mass (immonium/internal-like) peaks and 5 ppm error. The final SpecNovo model was fine-tuned on this corpus for 800 steps (lr 10⁻⁴, 50 warm-up steps).</w:t>
+      </w:r>
+    </w:p>
+    <w:p>
+      <w:pPr>
+        <w:pStyle w:val="BodyText"/>
+      </w:pPr>
+      <w:r>
+        <w:rPr>
+          <w:bCs/>
+          <w:b/>
+        </w:rPr>
+        <w:t xml:space="preserve">Real-data de novo evaluation.</w:t>
+      </w:r>
+      <w:r>
+        <w:t xml:space="preserve"> </w:t>
+      </w:r>
+      <w:r>
+        <w:t xml:space="preserve">Spectra were preprocessed by removing peaks within 2 m/z of the precursor and above the precursor mass, keeping the 80 most intense peaks and applying square-root normalisation. SpecNovo (zero-shot and calibrated) and the spectrum-graph baseline (tolerance 0.025 Da for HCD, 0.5 Da for CID) were scored with the metrics above. 95 % confidence intervals came from 2,000 paired bootstrap resamples of spectra.</w:t>
+      </w:r>
+    </w:p>
+    <w:p>
+      <w:pPr>
+        <w:pStyle w:val="BodyText"/>
+      </w:pPr>
+      <w:r>
+        <w:rPr>
+          <w:bCs/>
+          <w:b/>
+        </w:rPr>
+        <w:t xml:space="preserve">Real MS1 bottleneck.</w:t>
+      </w:r>
+      <w:r>
+        <w:t xml:space="preserve"> </w:t>
+      </w:r>
+      <w:r>
+        <w:t xml:space="preserve">MS1 centroids (top 400 per scan) were linked across scans within 10 ppm, allowing gaps of up to two scans and requiring ≥ 3 scans. Isotopic peaks (z = 1–4, +1/+2 neutrons, co-eluting within 15 s) were removed. A feature was counted as</w:t>
+      </w:r>
+      <w:r>
+        <w:t xml:space="preserve"> </w:t>
+      </w:r>
+      <w:r>
+        <w:rPr>
+          <w:iCs/>
+          <w:i/>
+        </w:rPr>
+        <w:t xml:space="preserve">sampled</w:t>
+      </w:r>
+      <w:r>
+        <w:t xml:space="preserve"> </w:t>
+      </w:r>
+      <w:r>
+        <w:t xml:space="preserve">if an MS2 precursor fell within 10 ppm and inside its elution window ± 30 s, and as</w:t>
+      </w:r>
+      <w:r>
+        <w:t xml:space="preserve"> </w:t>
+      </w:r>
+      <w:r>
+        <w:rPr>
+          <w:iCs/>
+          <w:i/>
+        </w:rPr>
+        <w:t xml:space="preserve">identified</w:t>
+      </w:r>
+      <w:r>
+        <w:t xml:space="preserve"> </w:t>
+      </w:r>
+      <w:r>
+        <w:t xml:space="preserve">if that MS2 spectrum was a 1 % FDR PSM. Features from the two fractions of each sample were pooled and clustered across the three samples (10 ppm, 60 s) to compare identification-free and identification-first completeness.</w:t>
+      </w:r>
+    </w:p>
     <w:bookmarkEnd w:id="27"/>
-    <w:bookmarkStart w:id="53" w:name="results"/>
+    <w:bookmarkEnd w:id="28"/>
+    <w:bookmarkStart w:id="58" w:name="results"/>
     <w:p>
       <w:pPr>
         <w:pStyle w:val="Heading1"/>
@@ -1911,7 +2434,7 @@
         <w:t xml:space="preserve">Results</w:t>
       </w:r>
     </w:p>
-    <w:bookmarkStart w:id="37" w:name="Xf4b0cf4b7c9e00760672d68de9d91a4a0d978d4"/>
+    <w:bookmarkStart w:id="38" w:name="Xf4b0cf4b7c9e00760672d68de9d91a4a0d978d4"/>
     <w:p>
       <w:pPr>
         <w:pStyle w:val="Heading2"/>
@@ -1948,18 +2471,18 @@
           <wp:inline>
             <wp:extent cx="5302908" cy="2724850"/>
             <wp:effectExtent b="0" l="0" r="0" t="0"/>
-            <wp:docPr descr="Fig. 1. From identification-first to spectrum-native proteomics. (a) The classical workflow loses unidentified spectra, variants, PTMs and non-canonical peptides at the search step, and creates missing values through stochastic DDA identification. (b) Spectrum-native models share an encoder that may be pretrained on unlabeled corpora and support database-free sequencing, identification-free phenotype prediction and representation learning." title="" id="29" name="Picture"/>
+            <wp:docPr descr="Fig. 1. From identification-first to spectrum-native proteomics. (a) The classical workflow loses unidentified spectra, variants, PTMs and non-canonical peptides at the search step, and creates missing values through stochastic DDA identification. (b) Spectrum-native models share an encoder that may be pretrained on unlabeled corpora and support database-free sequencing, identification-free phenotype prediction and representation learning." title="" id="30" name="Picture"/>
             <a:graphic>
               <a:graphicData uri="http://schemas.openxmlformats.org/drawingml/2006/picture">
                 <pic:pic>
                   <pic:nvPicPr>
-                    <pic:cNvPr descr="../figures/fig1_paradigm.png" id="30" name="Picture"/>
+                    <pic:cNvPr descr="../figures/fig1_paradigm.png" id="31" name="Picture"/>
                     <pic:cNvPicPr>
                       <a:picLocks noChangeArrowheads="1" noChangeAspect="1"/>
                     </pic:cNvPicPr>
                   </pic:nvPicPr>
                   <pic:blipFill>
-                    <a:blip r:embed="rId28"/>
+                    <a:blip r:embed="rId29"/>
                     <a:stretch>
                       <a:fillRect/>
                     </a:stretch>
@@ -2013,18 +2536,18 @@
           <wp:inline>
             <wp:extent cx="5334000" cy="4927053"/>
             <wp:effectExtent b="0" l="0" r="0" t="0"/>
-            <wp:docPr descr="Fig. 2. The virtual instrument. (a) Simulated MS2 spectrum of LVNEDTPAGLK with annotated b (blue) and y (red) ions; grey, noise and neutral-loss peaks. (b) Peptide-length distributions of training (proteome T) and test (proteome P) spectra. (c) Rendered LC-MS1 map of one run (64 RT × 256 m/z bins). (d) Mean case − control difference map; circles, library biomarkers; squares, unidentifiable biomarkers. (e) Total-ion chromatograms of the four acquisition sites. (f) MS1 feature landscape coloured by identifiability. (g) Abundance distribution and limit of detection (LOD)." title="" id="32" name="Picture"/>
+            <wp:docPr descr="Fig. 2. The virtual instrument. (a) Simulated MS2 spectrum of LVNEDTPAGLK with annotated b (blue) and y (red) ions; grey, noise and neutral-loss peaks. (b) Peptide-length distributions of training (proteome T) and test (proteome P) spectra. (c) Rendered LC-MS1 map of one run (64 RT × 256 m/z bins). (d) Mean case − control difference map; circles, library biomarkers; squares, unidentifiable biomarkers. (e) Total-ion chromatograms of the four acquisition sites. (f) MS1 feature landscape coloured by identifiability. (g) Abundance distribution and limit of detection (LOD)." title="" id="33" name="Picture"/>
             <a:graphic>
               <a:graphicData uri="http://schemas.openxmlformats.org/drawingml/2006/picture">
                 <pic:pic>
                   <pic:nvPicPr>
-                    <pic:cNvPr descr="../figures/fig2_virtual_instrument.png" id="33" name="Picture"/>
+                    <pic:cNvPr descr="../figures/fig2_virtual_instrument.png" id="34" name="Picture"/>
                     <pic:cNvPicPr>
                       <a:picLocks noChangeArrowheads="1" noChangeAspect="1"/>
                     </pic:cNvPicPr>
                   </pic:nvPicPr>
                   <pic:blipFill>
-                    <a:blip r:embed="rId31"/>
+                    <a:blip r:embed="rId32"/>
                     <a:stretch>
                       <a:fillRect/>
                     </a:stretch>
@@ -3611,18 +4134,18 @@
           <wp:inline>
             <wp:extent cx="5302908" cy="2513835"/>
             <wp:effectExtent b="0" l="0" r="0" t="0"/>
-            <wp:docPr descr="Fig. 3. Model architectures. (a) SpecNovo encodes peaks and their complementary masses, decodes residues conditioned on prefix and residual mass, and adds a differentiable ion-evidence logit; decoding is mass-constrained. (b) FeatureFormer tokenises identification-free MS1 features, is pretrained by masked-intensity modelling on unlabeled runs and fine-tuned for phenotype; gradient × input yields feature-level attributions." title="" id="35" name="Picture"/>
+            <wp:docPr descr="Fig. 3. Model architectures. (a) SpecNovo encodes peaks and their complementary masses, decodes residues conditioned on prefix and residual mass, and adds a differentiable ion-evidence logit; decoding is mass-constrained. (b) FeatureFormer tokenises identification-free MS1 features, is pretrained by masked-intensity modelling on unlabeled runs and fine-tuned for phenotype; gradient × input yields feature-level attributions." title="" id="36" name="Picture"/>
             <a:graphic>
               <a:graphicData uri="http://schemas.openxmlformats.org/drawingml/2006/picture">
                 <pic:pic>
                   <pic:nvPicPr>
-                    <pic:cNvPr descr="../figures/fig3_architecture.png" id="36" name="Picture"/>
+                    <pic:cNvPr descr="../figures/fig3_architecture.png" id="37" name="Picture"/>
                     <pic:cNvPicPr>
                       <a:picLocks noChangeArrowheads="1" noChangeAspect="1"/>
                     </pic:cNvPicPr>
                   </pic:nvPicPr>
                   <pic:blipFill>
-                    <a:blip r:embed="rId34"/>
+                    <a:blip r:embed="rId35"/>
                     <a:stretch>
                       <a:fillRect/>
                     </a:stretch>
@@ -3667,8 +4190,8 @@
         <w:t xml:space="preserve">(a) SpecNovo encodes peaks and their complementary masses, decodes residues conditioned on prefix and residual mass, and adds a differentiable ion-evidence logit; decoding is mass-constrained. (b) FeatureFormer tokenises identification-free MS1 features, is pretrained by masked-intensity modelling on unlabeled runs and fine-tuned for phenotype; gradient × input yields feature-level attributions.</w:t>
       </w:r>
     </w:p>
-    <w:bookmarkEnd w:id="37"/>
-    <w:bookmarkStart w:id="41" w:name="X9c23ffd35498ae2e8d17e255b751bfd5e723c68"/>
+    <w:bookmarkEnd w:id="38"/>
+    <w:bookmarkStart w:id="42" w:name="X9c23ffd35498ae2e8d17e255b751bfd5e723c68"/>
     <w:p>
       <w:pPr>
         <w:pStyle w:val="Heading2"/>
@@ -5211,18 +5734,18 @@
           <wp:inline>
             <wp:extent cx="5334000" cy="4831159"/>
             <wp:effectExtent b="0" l="0" r="0" t="0"/>
-            <wp:docPr descr="Fig. 4. De novo sequencing benchmark. (a) Validation token accuracy (teacher forcing) as a function of training spectra for the base transformer, the mass-aware variant and the ion-evidence variant (initialised from the mass-aware checkpoint). (b) Peptide precision–coverage curves on inDB. (c) Peptide recall of database search, spectrum-graph DP and SpecNovo on canonical, SAAV and novel-proteome spectra; hatched, database false identifications at 1 % FDR. (d, e) Peptide recall versus fragment observation probability and chemical-noise peaks. (f) Ablation: amino-acid precision and peptide recall on inDB; MA, mass-aware; EV, ion evidence; +Nk, additional training spectra." title="" id="39" name="Picture"/>
+            <wp:docPr descr="Fig. 4. De novo sequencing benchmark. (a) Validation token accuracy (teacher forcing) as a function of training spectra for the base transformer, the mass-aware variant and the ion-evidence variant (initialised from the mass-aware checkpoint). (b) Peptide precision–coverage curves on inDB. (c) Peptide recall of database search, spectrum-graph DP and SpecNovo on canonical, SAAV and novel-proteome spectra; hatched, database false identifications at 1 % FDR. (d, e) Peptide recall versus fragment observation probability and chemical-noise peaks. (f) Ablation: amino-acid precision and peptide recall on inDB; MA, mass-aware; EV, ion evidence; +Nk, additional training spectra." title="" id="40" name="Picture"/>
             <a:graphic>
               <a:graphicData uri="http://schemas.openxmlformats.org/drawingml/2006/picture">
                 <pic:pic>
                   <pic:nvPicPr>
-                    <pic:cNvPr descr="../figures/fig4_denovo.png" id="40" name="Picture"/>
+                    <pic:cNvPr descr="../figures/fig4_denovo.png" id="41" name="Picture"/>
                     <pic:cNvPicPr>
                       <a:picLocks noChangeArrowheads="1" noChangeAspect="1"/>
                     </pic:cNvPicPr>
                   </pic:nvPicPr>
                   <pic:blipFill>
-                    <a:blip r:embed="rId38"/>
+                    <a:blip r:embed="rId39"/>
                     <a:stretch>
                       <a:fillRect/>
                     </a:stretch>
@@ -5267,8 +5790,8 @@
         <w:t xml:space="preserve">(a) Validation token accuracy (teacher forcing) as a function of training spectra for the base transformer, the mass-aware variant and the ion-evidence variant (initialised from the mass-aware checkpoint). (b) Peptide precision–coverage curves on inDB. (c) Peptide recall of database search, spectrum-graph DP and SpecNovo on canonical, SAAV and novel-proteome spectra; hatched, database false identifications at 1 % FDR. (d, e) Peptide recall versus fragment observation probability and chemical-noise peaks. (f) Ablation: amino-acid precision and peptide recall on inDB; MA, mass-aware; EV, ion evidence; +Nk, additional training spectra.</w:t>
       </w:r>
     </w:p>
-    <w:bookmarkEnd w:id="41"/>
-    <w:bookmarkStart w:id="42" w:name="X42c43fec26ad749fe5441c43af6606669b04ca4"/>
+    <w:bookmarkEnd w:id="42"/>
+    <w:bookmarkStart w:id="43" w:name="X42c43fec26ad749fe5441c43af6606669b04ca4"/>
     <w:p>
       <w:pPr>
         <w:pStyle w:val="Heading2"/>
@@ -6081,8 +6604,8 @@
         </w:tc>
       </w:tr>
     </w:tbl>
-    <w:bookmarkEnd w:id="42"/>
-    <w:bookmarkStart w:id="43" w:name="Xca472718a2173925eaa16397091defad152ea45"/>
+    <w:bookmarkEnd w:id="43"/>
+    <w:bookmarkStart w:id="44" w:name="Xca472718a2173925eaa16397091defad152ea45"/>
     <w:p>
       <w:pPr>
         <w:pStyle w:val="Heading2"/>
@@ -7557,8 +8080,8 @@
         </w:tc>
       </w:tr>
     </w:tbl>
-    <w:bookmarkEnd w:id="43"/>
-    <w:bookmarkStart w:id="47" w:name="Xda4bae5dd94eab10636703ee5fe04d57d6fcbbe"/>
+    <w:bookmarkEnd w:id="44"/>
+    <w:bookmarkStart w:id="48" w:name="Xda4bae5dd94eab10636703ee5fe04d57d6fcbbe"/>
     <w:p>
       <w:pPr>
         <w:pStyle w:val="Heading2"/>
@@ -7622,18 +8145,18 @@
           <wp:inline>
             <wp:extent cx="5334000" cy="4368825"/>
             <wp:effectExtent b="0" l="0" r="0" t="0"/>
-            <wp:docPr descr="Fig. 5. Representations and interpretability of SpecNovo. (a, b) t-SNE of 480 replicate spectra (40 peptides × 12) using encoder embeddings (a) or binned spectra (b); six peptides highlighted. (c) Top-1 replicate retrieval and cosine silhouette. (d) Example spectrum: intensity (top; fragment ions blue) and gradient × input saliency (bottom; fragment ions orange). (e) Saliency share versus intensity share on annotated fragment ions for 300 inDB spectra; dashed line, identity." title="" id="45" name="Picture"/>
+            <wp:docPr descr="Fig. 5. Representations and interpretability of SpecNovo. (a, b) t-SNE of 480 replicate spectra (40 peptides × 12) using encoder embeddings (a) or binned spectra (b); six peptides highlighted. (c) Top-1 replicate retrieval and cosine silhouette. (d) Example spectrum: intensity (top; fragment ions blue) and gradient × input saliency (bottom; fragment ions orange). (e) Saliency share versus intensity share on annotated fragment ions for 300 inDB spectra; dashed line, identity." title="" id="46" name="Picture"/>
             <a:graphic>
               <a:graphicData uri="http://schemas.openxmlformats.org/drawingml/2006/picture">
                 <pic:pic>
                   <pic:nvPicPr>
-                    <pic:cNvPr descr="../figures/fig5_representation.png" id="46" name="Picture"/>
+                    <pic:cNvPr descr="../figures/fig5_representation.png" id="47" name="Picture"/>
                     <pic:cNvPicPr>
                       <a:picLocks noChangeArrowheads="1" noChangeAspect="1"/>
                     </pic:cNvPicPr>
                   </pic:nvPicPr>
                   <pic:blipFill>
-                    <a:blip r:embed="rId44"/>
+                    <a:blip r:embed="rId45"/>
                     <a:stretch>
                       <a:fillRect/>
                     </a:stretch>
@@ -8204,8 +8727,8 @@
         </w:tc>
       </w:tr>
     </w:tbl>
-    <w:bookmarkEnd w:id="47"/>
-    <w:bookmarkStart w:id="51" w:name="X06c146bbe83cb2d3aafef79fcb9fa2a0d457ddb"/>
+    <w:bookmarkEnd w:id="48"/>
+    <w:bookmarkStart w:id="52" w:name="X06c146bbe83cb2d3aafef79fcb9fa2a0d457ddb"/>
     <w:p>
       <w:pPr>
         <w:pStyle w:val="Heading2"/>
@@ -9020,18 +9543,18 @@
           <wp:inline>
             <wp:extent cx="5334000" cy="4635730"/>
             <wp:effectExtent b="0" l="0" r="0" t="0"/>
-            <wp:docPr descr="Fig. 6. Spectrum-to-phenotype benchmark. (a) Test AUROC versus number of labelled runs (mean ± s.d., three seeds; 50 % of biomarkers unidentifiable). (b) Leave-one-site-out AUROC on an unseen acquisition site. (c) AUROC (n = 192) versus fraction of biomarkers not identifiable by MS2 search. (d) FeatureFormer gradient × input attribution versus true effect size; library (circles) and unidentifiable (squares) biomarkers. (e) ROC curves on the unseen site (seed 0; colours as in a)." title="" id="49" name="Picture"/>
+            <wp:docPr descr="Fig. 6. Spectrum-to-phenotype benchmark. (a) Test AUROC versus number of labelled runs (mean ± s.d., three seeds; 50 % of biomarkers unidentifiable). (b) Leave-one-site-out AUROC on an unseen acquisition site. (c) AUROC (n = 192) versus fraction of biomarkers not identifiable by MS2 search. (d) FeatureFormer gradient × input attribution versus true effect size; library (circles) and unidentifiable (squares) biomarkers. (e) ROC curves on the unseen site (seed 0; colours as in a)." title="" id="50" name="Picture"/>
             <a:graphic>
               <a:graphicData uri="http://schemas.openxmlformats.org/drawingml/2006/picture">
                 <pic:pic>
                   <pic:nvPicPr>
-                    <pic:cNvPr descr="../figures/fig6_phenotype.png" id="50" name="Picture"/>
+                    <pic:cNvPr descr="../figures/fig6_phenotype.png" id="51" name="Picture"/>
                     <pic:cNvPicPr>
                       <a:picLocks noChangeArrowheads="1" noChangeAspect="1"/>
                     </pic:cNvPicPr>
                   </pic:nvPicPr>
                   <pic:blipFill>
-                    <a:blip r:embed="rId48"/>
+                    <a:blip r:embed="rId49"/>
                     <a:stretch>
                       <a:fillRect/>
                     </a:stretch>
@@ -9076,8 +9599,8 @@
         <w:t xml:space="preserve">(a) Test AUROC versus number of labelled runs (mean ± s.d., three seeds; 50 % of biomarkers unidentifiable). (b) Leave-one-site-out AUROC on an unseen acquisition site. (c) AUROC (n = 192) versus fraction of biomarkers not identifiable by MS2 search. (d) FeatureFormer gradient × input attribution versus true effect size; library (circles) and unidentifiable (squares) biomarkers. (e) ROC curves on the unseen site (seed 0; colours as in a).</w:t>
       </w:r>
     </w:p>
-    <w:bookmarkEnd w:id="51"/>
-    <w:bookmarkStart w:id="52" w:name="Xf7713a9a837408fee43f8b8f3fd2333544b8e7e"/>
+    <w:bookmarkEnd w:id="52"/>
+    <w:bookmarkStart w:id="53" w:name="Xf7713a9a837408fee43f8b8f3fd2333544b8e7e"/>
     <w:p>
       <w:pPr>
         <w:pStyle w:val="Heading2"/>
@@ -9596,42 +10119,35 @@
         </w:tc>
       </w:tr>
     </w:tbl>
-    <w:bookmarkEnd w:id="52"/>
     <w:bookmarkEnd w:id="53"/>
-    <w:bookmarkStart w:id="54" w:name="discussion"/>
-    <w:p>
-      <w:pPr>
-        <w:pStyle w:val="Heading1"/>
+    <w:bookmarkStart w:id="57" w:name="X3a8cbe6c864500ae77b49f2e7b0b728d65f31bd"/>
+    <w:p>
+      <w:pPr>
+        <w:pStyle w:val="Heading2"/>
       </w:pPr>
       <w:r>
         <w:rPr>
           <w:color w:val="1F2A44"/>
         </w:rPr>
-        <w:t xml:space="preserve">Discussion</w:t>
+        <w:t xml:space="preserve">Validation on real PRIDE and MassIVE-KB data</w:t>
       </w:r>
     </w:p>
     <w:p>
       <w:pPr>
         <w:pStyle w:val="FirstParagraph"/>
       </w:pPr>
-      <w:r>
-        <w:t xml:space="preserve">The move from identification-first to spectrum-native proteomics is often framed as a contest between classical algorithms and deep learning. The controlled measurements here suggest a more useful framing:</w:t>
-      </w:r>
-      <w:r>
-        <w:t xml:space="preserve"> </w:t>
-      </w:r>
       <w:r>
         <w:rPr>
           <w:bCs/>
           <w:b/>
         </w:rPr>
-        <w:t xml:space="preserve">identification is an information bottleneck, and the main gains come from removing that bottleneck.</w:t>
-      </w:r>
-      <w:r>
-        <w:t xml:space="preserve"> </w:t>
-      </w:r>
-      <w:r>
-        <w:t xml:space="preserve">The choice of model class matters less.</w:t>
+        <w:t xml:space="preserve">Real spectra are sparser and more y-dominated than the default simulator</w:t>
+      </w:r>
+      <w:r>
+        <w:t xml:space="preserve"> </w:t>
+      </w:r>
+      <w:r>
+        <w:t xml:space="preserve">(Table 9, Fig. 7c). On 126 MassIVE-KB HCD spectra the median b-ion observation rate was 0.29 (IQR 0.14–0.50) against 0.78 in the default simulator, while y-ion observation was 0.67 (0.50–0.86). Summed y/b intensity was 2.7 against 1.7, and b/y-family ions explained 32 % of the total ion current against 52 %.</w:t>
       </w:r>
     </w:p>
     <w:p>
@@ -9639,68 +10155,805 @@
         <w:pStyle w:val="BodyText"/>
       </w:pPr>
       <w:r>
-        <w:t xml:space="preserve">On the MS1 side, the bottleneck alone accounts for a 0.33 AUROC difference at n = 192 (0.648 vs 0.975), and it grows with the size of the dark proteome. This mirrors the ProFormer observation that identification-free MS1 classification is both faster and more accurate than interpretation-based workflows [17]. It also explains why match-between-runs is so valuable in practice [2]: MBR recovers the missing values, but not the biomarkers that were never identified.</w:t>
+        <w:t xml:space="preserve">The proline effect (1.98 vs 1.73) and the number of unexplained peaks (38.5 vs 41) were close to the simulator. The fragment mass error was tighter in the real data (s.d. 4.4 ppm against 8.9 ppm). PRIDE BSA ion-trap CID spectra were different again: about 145 peaks per spectrum, 59 % of the ion current explained, y/b ratio 4.1 and fragment errors of several hundred ppm (Table 9). These measurements identify the simulator’s main miscalibration as the overly symmetric b/y fragmentation.</w:t>
       </w:r>
     </w:p>
     <w:p>
       <w:pPr>
         <w:pStyle w:val="BodyText"/>
       </w:pPr>
-      <w:r>
-        <w:t xml:space="preserve">On the MS2 side, database search remains unbeatable for canonical peptides but recovers nothing beyond its database. De novo sequencing provides access to variant and novel sequences at a fixed, database-independent rate, which matters for immunopeptidomics, metaproteomics, antibody sequencing and proteogenomic variant detection [9,10].</w:t>
-      </w:r>
-    </w:p>
-    <w:p>
-      <w:pPr>
-        <w:pStyle w:val="BodyText"/>
-      </w:pPr>
-      <w:r>
-        <w:t xml:space="preserve">The second lesson concerns</w:t>
-      </w:r>
-      <w:r>
-        <w:t xml:space="preserve"> </w:t>
-      </w:r>
       <w:r>
         <w:rPr>
           <w:bCs/>
           <w:b/>
         </w:rPr>
-        <w:t xml:space="preserve">data efficiency</w:t>
-      </w:r>
-      <w:r>
-        <w:t xml:space="preserve">. A generic sequence-to-sequence transformer trained on ≈ 0.45 M spectra learned a sequence language model but not spectrum interpretation, and was useless under mass-constrained decoding. A small, physics-informed ion-evidence term, analogous to the ion-location features of DeepNovo [15] and to pairwise mass-difference attention [13], made the same architecture competitive within a few hundred additional optimisation steps.</w:t>
-      </w:r>
-    </w:p>
+        <w:t xml:space="preserve">Table 9. Calibration of the virtual instrument against real annotated spectra (median [IQR] per PSM).</w:t>
+      </w:r>
+    </w:p>
+    <w:tbl>
+      <w:tblPr>
+        <w:tblStyle w:val="Table"/>
+        <w:tblW w:type="pct" w:w="5000"/>
+        <w:tblLook w:firstRow="1" w:lastRow="0" w:firstColumn="0" w:lastColumn="0" w:noHBand="0" w:noVBand="0" w:val="0020"/>
+        <w:jc w:val="start"/>
+        <w:tblBorders>
+          <w:top w:val="single" w:sz="12" w:color="000000"/>
+          <w:bottom w:val="single" w:sz="12" w:color="000000"/>
+          <w:insideH w:val="single" w:sz="4" w:color="000000"/>
+        </w:tblBorders>
+      </w:tblPr>
+      <w:tblGrid>
+        <w:gridCol w:w="1980"/>
+        <w:gridCol w:w="1980"/>
+        <w:gridCol w:w="1980"/>
+        <w:gridCol w:w="1980"/>
+      </w:tblGrid>
+      <w:tr>
+        <w:trPr>
+          <w:tblHeader w:val="true"/>
+        </w:trPr>
+        <w:tc>
+          <w:tcPr/>
+          <w:p>
+            <w:pPr>
+              <w:pStyle w:val="Compact"/>
+              <w:spacing w:after="20"/>
+              <w:jc w:val="left"/>
+            </w:pPr>
+            <w:r>
+              <w:rPr>
+                <w:rFonts w:ascii="Times New Roman" w:hAnsi="Times New Roman"/>
+                <w:b/>
+                <w:sz w:val="17"/>
+              </w:rPr>
+              <w:t xml:space="preserve">Statistic</w:t>
+            </w:r>
+          </w:p>
+        </w:tc>
+        <w:tc>
+          <w:tcPr/>
+          <w:p>
+            <w:pPr>
+              <w:pStyle w:val="Compact"/>
+              <w:spacing w:after="20"/>
+              <w:jc w:val="left"/>
+            </w:pPr>
+            <w:r>
+              <w:rPr>
+                <w:rFonts w:ascii="Times New Roman" w:hAnsi="Times New Roman"/>
+                <w:b/>
+                <w:sz w:val="17"/>
+              </w:rPr>
+              <w:t xml:space="preserve">Simulator (default)</w:t>
+            </w:r>
+          </w:p>
+        </w:tc>
+        <w:tc>
+          <w:tcPr/>
+          <w:p>
+            <w:pPr>
+              <w:pStyle w:val="Compact"/>
+              <w:spacing w:after="20"/>
+              <w:jc w:val="left"/>
+            </w:pPr>
+            <w:r>
+              <w:rPr>
+                <w:rFonts w:ascii="Times New Roman" w:hAnsi="Times New Roman"/>
+                <w:b/>
+                <w:sz w:val="17"/>
+              </w:rPr>
+              <w:t xml:space="preserve">MassIVE-KB HCD (real)</w:t>
+            </w:r>
+          </w:p>
+        </w:tc>
+        <w:tc>
+          <w:tcPr/>
+          <w:p>
+            <w:pPr>
+              <w:pStyle w:val="Compact"/>
+              <w:spacing w:after="20"/>
+              <w:jc w:val="left"/>
+            </w:pPr>
+            <w:r>
+              <w:rPr>
+                <w:rFonts w:ascii="Times New Roman" w:hAnsi="Times New Roman"/>
+                <w:b/>
+                <w:sz w:val="17"/>
+              </w:rPr>
+              <w:t xml:space="preserve">PRIDE BSA CID (real)</w:t>
+            </w:r>
+          </w:p>
+        </w:tc>
+      </w:tr>
+      <w:tr>
+        <w:tc>
+          <w:tcPr/>
+          <w:p>
+            <w:pPr>
+              <w:pStyle w:val="Compact"/>
+              <w:spacing w:after="20"/>
+              <w:jc w:val="left"/>
+            </w:pPr>
+            <w:r>
+              <w:rPr>
+                <w:rFonts w:ascii="Times New Roman" w:hAnsi="Times New Roman"/>
+                <w:sz w:val="17"/>
+              </w:rPr>
+              <w:t xml:space="preserve">PSMs analysed</w:t>
+            </w:r>
+          </w:p>
+        </w:tc>
+        <w:tc>
+          <w:tcPr/>
+          <w:p>
+            <w:pPr>
+              <w:pStyle w:val="Compact"/>
+              <w:spacing w:after="20"/>
+              <w:jc w:val="left"/>
+            </w:pPr>
+            <w:r>
+              <w:rPr>
+                <w:rFonts w:ascii="Times New Roman" w:hAnsi="Times New Roman"/>
+                <w:sz w:val="17"/>
+              </w:rPr>
+              <w:t xml:space="preserve">500</w:t>
+            </w:r>
+          </w:p>
+        </w:tc>
+        <w:tc>
+          <w:tcPr/>
+          <w:p>
+            <w:pPr>
+              <w:pStyle w:val="Compact"/>
+              <w:spacing w:after="20"/>
+              <w:jc w:val="left"/>
+            </w:pPr>
+            <w:r>
+              <w:rPr>
+                <w:rFonts w:ascii="Times New Roman" w:hAnsi="Times New Roman"/>
+                <w:sz w:val="17"/>
+              </w:rPr>
+              <w:t xml:space="preserve">126</w:t>
+            </w:r>
+          </w:p>
+        </w:tc>
+        <w:tc>
+          <w:tcPr/>
+          <w:p>
+            <w:pPr>
+              <w:pStyle w:val="Compact"/>
+              <w:spacing w:after="20"/>
+              <w:jc w:val="left"/>
+            </w:pPr>
+            <w:r>
+              <w:rPr>
+                <w:rFonts w:ascii="Times New Roman" w:hAnsi="Times New Roman"/>
+                <w:sz w:val="17"/>
+              </w:rPr>
+              <w:t xml:space="preserve">64</w:t>
+            </w:r>
+          </w:p>
+        </w:tc>
+      </w:tr>
+      <w:tr>
+        <w:tc>
+          <w:tcPr/>
+          <w:p>
+            <w:pPr>
+              <w:pStyle w:val="Compact"/>
+              <w:spacing w:after="20"/>
+              <w:jc w:val="left"/>
+            </w:pPr>
+            <w:r>
+              <w:rPr>
+                <w:rFonts w:ascii="Times New Roman" w:hAnsi="Times New Roman"/>
+                <w:sz w:val="17"/>
+              </w:rPr>
+              <w:t xml:space="preserve">b-ion observation rate</w:t>
+            </w:r>
+          </w:p>
+        </w:tc>
+        <w:tc>
+          <w:tcPr/>
+          <w:p>
+            <w:pPr>
+              <w:pStyle w:val="Compact"/>
+              <w:spacing w:after="20"/>
+              <w:jc w:val="left"/>
+            </w:pPr>
+            <w:r>
+              <w:rPr>
+                <w:rFonts w:ascii="Times New Roman" w:hAnsi="Times New Roman"/>
+                <w:sz w:val="17"/>
+              </w:rPr>
+              <w:t xml:space="preserve">0.78 [0.67–0.88]</w:t>
+            </w:r>
+          </w:p>
+        </w:tc>
+        <w:tc>
+          <w:tcPr/>
+          <w:p>
+            <w:pPr>
+              <w:pStyle w:val="Compact"/>
+              <w:spacing w:after="20"/>
+              <w:jc w:val="left"/>
+            </w:pPr>
+            <w:r>
+              <w:rPr>
+                <w:rFonts w:ascii="Times New Roman" w:hAnsi="Times New Roman"/>
+                <w:sz w:val="17"/>
+              </w:rPr>
+              <w:t xml:space="preserve">0.29 [0.14–0.50]</w:t>
+            </w:r>
+          </w:p>
+        </w:tc>
+        <w:tc>
+          <w:tcPr/>
+          <w:p>
+            <w:pPr>
+              <w:pStyle w:val="Compact"/>
+              <w:spacing w:after="20"/>
+              <w:jc w:val="left"/>
+            </w:pPr>
+            <w:r>
+              <w:rPr>
+                <w:rFonts w:ascii="Times New Roman" w:hAnsi="Times New Roman"/>
+                <w:sz w:val="17"/>
+              </w:rPr>
+              <w:t xml:space="preserve">0.69 [0.50–0.79]</w:t>
+            </w:r>
+          </w:p>
+        </w:tc>
+      </w:tr>
+      <w:tr>
+        <w:tc>
+          <w:tcPr/>
+          <w:p>
+            <w:pPr>
+              <w:pStyle w:val="Compact"/>
+              <w:spacing w:after="20"/>
+              <w:jc w:val="left"/>
+            </w:pPr>
+            <w:r>
+              <w:rPr>
+                <w:rFonts w:ascii="Times New Roman" w:hAnsi="Times New Roman"/>
+                <w:sz w:val="17"/>
+              </w:rPr>
+              <w:t xml:space="preserve">y-ion observation rate</w:t>
+            </w:r>
+          </w:p>
+        </w:tc>
+        <w:tc>
+          <w:tcPr/>
+          <w:p>
+            <w:pPr>
+              <w:pStyle w:val="Compact"/>
+              <w:spacing w:after="20"/>
+              <w:jc w:val="left"/>
+            </w:pPr>
+            <w:r>
+              <w:rPr>
+                <w:rFonts w:ascii="Times New Roman" w:hAnsi="Times New Roman"/>
+                <w:sz w:val="17"/>
+              </w:rPr>
+              <w:t xml:space="preserve">0.78 [0.67–0.88]</w:t>
+            </w:r>
+          </w:p>
+        </w:tc>
+        <w:tc>
+          <w:tcPr/>
+          <w:p>
+            <w:pPr>
+              <w:pStyle w:val="Compact"/>
+              <w:spacing w:after="20"/>
+              <w:jc w:val="left"/>
+            </w:pPr>
+            <w:r>
+              <w:rPr>
+                <w:rFonts w:ascii="Times New Roman" w:hAnsi="Times New Roman"/>
+                <w:sz w:val="17"/>
+              </w:rPr>
+              <w:t xml:space="preserve">0.67 [0.50–0.86]</w:t>
+            </w:r>
+          </w:p>
+        </w:tc>
+        <w:tc>
+          <w:tcPr/>
+          <w:p>
+            <w:pPr>
+              <w:pStyle w:val="Compact"/>
+              <w:spacing w:after="20"/>
+              <w:jc w:val="left"/>
+            </w:pPr>
+            <w:r>
+              <w:rPr>
+                <w:rFonts w:ascii="Times New Roman" w:hAnsi="Times New Roman"/>
+                <w:sz w:val="17"/>
+              </w:rPr>
+              <w:t xml:space="preserve">0.83 [0.67–0.89]</w:t>
+            </w:r>
+          </w:p>
+        </w:tc>
+      </w:tr>
+      <w:tr>
+        <w:tc>
+          <w:tcPr/>
+          <w:p>
+            <w:pPr>
+              <w:pStyle w:val="Compact"/>
+              <w:spacing w:after="20"/>
+              <w:jc w:val="left"/>
+            </w:pPr>
+            <w:r>
+              <w:rPr>
+                <w:rFonts w:ascii="Times New Roman" w:hAnsi="Times New Roman"/>
+                <w:sz w:val="17"/>
+              </w:rPr>
+              <w:t xml:space="preserve">Summed y/b intensity</w:t>
+            </w:r>
+          </w:p>
+        </w:tc>
+        <w:tc>
+          <w:tcPr/>
+          <w:p>
+            <w:pPr>
+              <w:pStyle w:val="Compact"/>
+              <w:spacing w:after="20"/>
+              <w:jc w:val="left"/>
+            </w:pPr>
+            <w:r>
+              <w:rPr>
+                <w:rFonts w:ascii="Times New Roman" w:hAnsi="Times New Roman"/>
+                <w:sz w:val="17"/>
+              </w:rPr>
+              <w:t xml:space="preserve">1.66 [1.12–2.27]</w:t>
+            </w:r>
+          </w:p>
+        </w:tc>
+        <w:tc>
+          <w:tcPr/>
+          <w:p>
+            <w:pPr>
+              <w:pStyle w:val="Compact"/>
+              <w:spacing w:after="20"/>
+              <w:jc w:val="left"/>
+            </w:pPr>
+            <w:r>
+              <w:rPr>
+                <w:rFonts w:ascii="Times New Roman" w:hAnsi="Times New Roman"/>
+                <w:sz w:val="17"/>
+              </w:rPr>
+              <w:t xml:space="preserve">2.66 [1.59–4.78]</w:t>
+            </w:r>
+          </w:p>
+        </w:tc>
+        <w:tc>
+          <w:tcPr/>
+          <w:p>
+            <w:pPr>
+              <w:pStyle w:val="Compact"/>
+              <w:spacing w:after="20"/>
+              <w:jc w:val="left"/>
+            </w:pPr>
+            <w:r>
+              <w:rPr>
+                <w:rFonts w:ascii="Times New Roman" w:hAnsi="Times New Roman"/>
+                <w:sz w:val="17"/>
+              </w:rPr>
+              <w:t xml:space="preserve">4.08 [2.51–6.44]</w:t>
+            </w:r>
+          </w:p>
+        </w:tc>
+      </w:tr>
+      <w:tr>
+        <w:tc>
+          <w:tcPr/>
+          <w:p>
+            <w:pPr>
+              <w:pStyle w:val="Compact"/>
+              <w:spacing w:after="20"/>
+              <w:jc w:val="left"/>
+            </w:pPr>
+            <w:r>
+              <w:rPr>
+                <w:rFonts w:ascii="Times New Roman" w:hAnsi="Times New Roman"/>
+                <w:sz w:val="17"/>
+              </w:rPr>
+              <w:t xml:space="preserve">Pro N-terminal cleavage enhancement</w:t>
+            </w:r>
+          </w:p>
+        </w:tc>
+        <w:tc>
+          <w:tcPr/>
+          <w:p>
+            <w:pPr>
+              <w:pStyle w:val="Compact"/>
+              <w:spacing w:after="20"/>
+              <w:jc w:val="left"/>
+            </w:pPr>
+            <w:r>
+              <w:rPr>
+                <w:rFonts w:ascii="Times New Roman" w:hAnsi="Times New Roman"/>
+                <w:sz w:val="17"/>
+              </w:rPr>
+              <w:t xml:space="preserve">1.73 [0.91–2.77]</w:t>
+            </w:r>
+          </w:p>
+        </w:tc>
+        <w:tc>
+          <w:tcPr/>
+          <w:p>
+            <w:pPr>
+              <w:pStyle w:val="Compact"/>
+              <w:spacing w:after="20"/>
+              <w:jc w:val="left"/>
+            </w:pPr>
+            <w:r>
+              <w:rPr>
+                <w:rFonts w:ascii="Times New Roman" w:hAnsi="Times New Roman"/>
+                <w:sz w:val="17"/>
+              </w:rPr>
+              <w:t xml:space="preserve">1.98 [1.25–3.69]</w:t>
+            </w:r>
+          </w:p>
+        </w:tc>
+        <w:tc>
+          <w:tcPr/>
+          <w:p>
+            <w:pPr>
+              <w:pStyle w:val="Compact"/>
+              <w:spacing w:after="20"/>
+              <w:jc w:val="left"/>
+            </w:pPr>
+            <w:r>
+              <w:rPr>
+                <w:rFonts w:ascii="Times New Roman" w:hAnsi="Times New Roman"/>
+                <w:sz w:val="17"/>
+              </w:rPr>
+              <w:t xml:space="preserve">2.09 [0.98–3.29]</w:t>
+            </w:r>
+          </w:p>
+        </w:tc>
+      </w:tr>
+      <w:tr>
+        <w:tc>
+          <w:tcPr/>
+          <w:p>
+            <w:pPr>
+              <w:pStyle w:val="Compact"/>
+              <w:spacing w:after="20"/>
+              <w:jc w:val="left"/>
+            </w:pPr>
+            <w:r>
+              <w:rPr>
+                <w:rFonts w:ascii="Times New Roman" w:hAnsi="Times New Roman"/>
+                <w:sz w:val="17"/>
+              </w:rPr>
+              <w:t xml:space="preserve">Fraction of TIC explained</w:t>
+            </w:r>
+          </w:p>
+        </w:tc>
+        <w:tc>
+          <w:tcPr/>
+          <w:p>
+            <w:pPr>
+              <w:pStyle w:val="Compact"/>
+              <w:spacing w:after="20"/>
+              <w:jc w:val="left"/>
+            </w:pPr>
+            <w:r>
+              <w:rPr>
+                <w:rFonts w:ascii="Times New Roman" w:hAnsi="Times New Roman"/>
+                <w:sz w:val="17"/>
+              </w:rPr>
+              <w:t xml:space="preserve">0.52 [0.44–0.60]</w:t>
+            </w:r>
+          </w:p>
+        </w:tc>
+        <w:tc>
+          <w:tcPr/>
+          <w:p>
+            <w:pPr>
+              <w:pStyle w:val="Compact"/>
+              <w:spacing w:after="20"/>
+              <w:jc w:val="left"/>
+            </w:pPr>
+            <w:r>
+              <w:rPr>
+                <w:rFonts w:ascii="Times New Roman" w:hAnsi="Times New Roman"/>
+                <w:sz w:val="17"/>
+              </w:rPr>
+              <w:t xml:space="preserve">0.32 [0.24–0.43]</w:t>
+            </w:r>
+          </w:p>
+        </w:tc>
+        <w:tc>
+          <w:tcPr/>
+          <w:p>
+            <w:pPr>
+              <w:pStyle w:val="Compact"/>
+              <w:spacing w:after="20"/>
+              <w:jc w:val="left"/>
+            </w:pPr>
+            <w:r>
+              <w:rPr>
+                <w:rFonts w:ascii="Times New Roman" w:hAnsi="Times New Roman"/>
+                <w:sz w:val="17"/>
+              </w:rPr>
+              <w:t xml:space="preserve">0.59 [0.45–0.68]</w:t>
+            </w:r>
+          </w:p>
+        </w:tc>
+      </w:tr>
+      <w:tr>
+        <w:tc>
+          <w:tcPr/>
+          <w:p>
+            <w:pPr>
+              <w:pStyle w:val="Compact"/>
+              <w:spacing w:after="20"/>
+              <w:jc w:val="left"/>
+            </w:pPr>
+            <w:r>
+              <w:rPr>
+                <w:rFonts w:ascii="Times New Roman" w:hAnsi="Times New Roman"/>
+                <w:sz w:val="17"/>
+              </w:rPr>
+              <w:t xml:space="preserve">Peaks per spectrum</w:t>
+            </w:r>
+          </w:p>
+        </w:tc>
+        <w:tc>
+          <w:tcPr/>
+          <w:p>
+            <w:pPr>
+              <w:pStyle w:val="Compact"/>
+              <w:spacing w:after="20"/>
+              <w:jc w:val="left"/>
+            </w:pPr>
+            <w:r>
+              <w:rPr>
+                <w:rFonts w:ascii="Times New Roman" w:hAnsi="Times New Roman"/>
+                <w:sz w:val="17"/>
+              </w:rPr>
+              <w:t xml:space="preserve">62 [55–68]</w:t>
+            </w:r>
+          </w:p>
+        </w:tc>
+        <w:tc>
+          <w:tcPr/>
+          <w:p>
+            <w:pPr>
+              <w:pStyle w:val="Compact"/>
+              <w:spacing w:after="20"/>
+              <w:jc w:val="left"/>
+            </w:pPr>
+            <w:r>
+              <w:rPr>
+                <w:rFonts w:ascii="Times New Roman" w:hAnsi="Times New Roman"/>
+                <w:sz w:val="17"/>
+              </w:rPr>
+              <w:t xml:space="preserve">53 [38–70]</w:t>
+            </w:r>
+          </w:p>
+        </w:tc>
+        <w:tc>
+          <w:tcPr/>
+          <w:p>
+            <w:pPr>
+              <w:pStyle w:val="Compact"/>
+              <w:spacing w:after="20"/>
+              <w:jc w:val="left"/>
+            </w:pPr>
+            <w:r>
+              <w:rPr>
+                <w:rFonts w:ascii="Times New Roman" w:hAnsi="Times New Roman"/>
+                <w:sz w:val="17"/>
+              </w:rPr>
+              <w:t xml:space="preserve">145 [114–192]</w:t>
+            </w:r>
+          </w:p>
+        </w:tc>
+      </w:tr>
+      <w:tr>
+        <w:tc>
+          <w:tcPr/>
+          <w:p>
+            <w:pPr>
+              <w:pStyle w:val="Compact"/>
+              <w:spacing w:after="20"/>
+              <w:jc w:val="left"/>
+            </w:pPr>
+            <w:r>
+              <w:rPr>
+                <w:rFonts w:ascii="Times New Roman" w:hAnsi="Times New Roman"/>
+                <w:sz w:val="17"/>
+              </w:rPr>
+              <w:t xml:space="preserve">Unexplained peaks</w:t>
+            </w:r>
+          </w:p>
+        </w:tc>
+        <w:tc>
+          <w:tcPr/>
+          <w:p>
+            <w:pPr>
+              <w:pStyle w:val="Compact"/>
+              <w:spacing w:after="20"/>
+              <w:jc w:val="left"/>
+            </w:pPr>
+            <w:r>
+              <w:rPr>
+                <w:rFonts w:ascii="Times New Roman" w:hAnsi="Times New Roman"/>
+                <w:sz w:val="17"/>
+              </w:rPr>
+              <w:t xml:space="preserve">41 [37–45]</w:t>
+            </w:r>
+          </w:p>
+        </w:tc>
+        <w:tc>
+          <w:tcPr/>
+          <w:p>
+            <w:pPr>
+              <w:pStyle w:val="Compact"/>
+              <w:spacing w:after="20"/>
+              <w:jc w:val="left"/>
+            </w:pPr>
+            <w:r>
+              <w:rPr>
+                <w:rFonts w:ascii="Times New Roman" w:hAnsi="Times New Roman"/>
+                <w:sz w:val="17"/>
+              </w:rPr>
+              <w:t xml:space="preserve">38.5 [26–55]</w:t>
+            </w:r>
+          </w:p>
+        </w:tc>
+        <w:tc>
+          <w:tcPr/>
+          <w:p>
+            <w:pPr>
+              <w:pStyle w:val="Compact"/>
+              <w:spacing w:after="20"/>
+              <w:jc w:val="left"/>
+            </w:pPr>
+            <w:r>
+              <w:rPr>
+                <w:rFonts w:ascii="Times New Roman" w:hAnsi="Times New Roman"/>
+                <w:sz w:val="17"/>
+              </w:rPr>
+              <w:t xml:space="preserve">116.5 [90–162]</w:t>
+            </w:r>
+          </w:p>
+        </w:tc>
+      </w:tr>
+      <w:tr>
+        <w:tc>
+          <w:tcPr/>
+          <w:p>
+            <w:pPr>
+              <w:pStyle w:val="Compact"/>
+              <w:spacing w:after="20"/>
+              <w:jc w:val="left"/>
+            </w:pPr>
+            <w:r>
+              <w:rPr>
+                <w:rFonts w:ascii="Times New Roman" w:hAnsi="Times New Roman"/>
+                <w:sz w:val="17"/>
+              </w:rPr>
+              <w:t xml:space="preserve">Fragment mass error (s.d.)</w:t>
+            </w:r>
+          </w:p>
+        </w:tc>
+        <w:tc>
+          <w:tcPr/>
+          <w:p>
+            <w:pPr>
+              <w:pStyle w:val="Compact"/>
+              <w:spacing w:after="20"/>
+              <w:jc w:val="left"/>
+            </w:pPr>
+            <w:r>
+              <w:rPr>
+                <w:rFonts w:ascii="Times New Roman" w:hAnsi="Times New Roman"/>
+                <w:sz w:val="17"/>
+              </w:rPr>
+              <w:t xml:space="preserve">8.9 ppm</w:t>
+            </w:r>
+          </w:p>
+        </w:tc>
+        <w:tc>
+          <w:tcPr/>
+          <w:p>
+            <w:pPr>
+              <w:pStyle w:val="Compact"/>
+              <w:spacing w:after="20"/>
+              <w:jc w:val="left"/>
+            </w:pPr>
+            <w:r>
+              <w:rPr>
+                <w:rFonts w:ascii="Times New Roman" w:hAnsi="Times New Roman"/>
+                <w:sz w:val="17"/>
+              </w:rPr>
+              <w:t xml:space="preserve">4.4 ppm</w:t>
+            </w:r>
+          </w:p>
+        </w:tc>
+        <w:tc>
+          <w:tcPr/>
+          <w:p>
+            <w:pPr>
+              <w:pStyle w:val="Compact"/>
+              <w:spacing w:after="20"/>
+              <w:jc w:val="left"/>
+            </w:pPr>
+            <w:r>
+              <w:rPr>
+                <w:rFonts w:ascii="Times New Roman" w:hAnsi="Times New Roman"/>
+                <w:sz w:val="17"/>
+              </w:rPr>
+              <w:t xml:space="preserve">323 ppm (ion trap)</w:t>
+            </w:r>
+          </w:p>
+        </w:tc>
+      </w:tr>
+    </w:tbl>
     <w:p>
       <w:pPr>
         <w:pStyle w:val="BodyText"/>
       </w:pPr>
-      <w:r>
-        <w:t xml:space="preserve">This result is directly relevant to the vision of proteomics GPTs trained on MassNet-style corpora. Corpus scale and inductive bias are substitutes, and at the scales available to most laboratories, inductive bias is cheaper. Conversely, the gap between our CPU-scale model and published models trained on tens of millions of spectra [9,10] is consistent with data scaling, not architectural limits, being the main driver of state-of-the-art de novo accuracy.</w:t>
-      </w:r>
-    </w:p>
-    <w:p>
-      <w:pPr>
-        <w:pStyle w:val="BodyText"/>
-      </w:pPr>
-      <w:r>
-        <w:t xml:space="preserve">Third,</w:t>
-      </w:r>
-      <w:r>
-        <w:t xml:space="preserve"> </w:t>
-      </w:r>
       <w:r>
         <w:rPr>
           <w:bCs/>
           <w:b/>
         </w:rPr>
-        <w:t xml:space="preserve">self-supervised pretraining is not a free lunch at small scale.</w:t>
-      </w:r>
-      <w:r>
-        <w:t xml:space="preserve"> </w:t>
-      </w:r>
-      <w:r>
-        <w:t xml:space="preserve">Masked-intensity pretraining on 800 unlabeled runs did not improve in-distribution phenotype prediction, but it consistently improved cross-site transfer and reduced variance. This pattern is expected if pretraining learns site-invariant co-abundance structure rather than phenotype-specific signal. It suggests that the payoff of corpus-scale pretraining will appear first in robustness and transfer across instruments, laboratories and cohorts.</w:t>
+        <w:t xml:space="preserve">Identification on real PRIDE runs reproduces the identification bottleneck.</w:t>
+      </w:r>
+      <w:r>
+        <w:t xml:space="preserve"> </w:t>
+      </w:r>
+      <w:r>
+        <w:t xml:space="preserve">The binomial-score search separated targets from decoys (Fig. 7b) and accepted 64 PSMs (20 unique BSA peptides) at 1 % FDR. That is 2.0 % of the 3,135 MS2 spectra; under the conservative (</w:t>
+      </w:r>
+      <w:r>
+        <w:rPr>
+          <w:iCs/>
+          <w:i/>
+        </w:rPr>
+        <w:t xml:space="preserve">d</w:t>
+      </w:r>
+      <w:r>
+        <w:t xml:space="preserve"> </w:t>
+      </w:r>
+      <w:r>
+        <w:t xml:space="preserve">+ 1)/</w:t>
+      </w:r>
+      <w:r>
+        <w:rPr>
+          <w:iCs/>
+          <w:i/>
+        </w:rPr>
+        <w:t xml:space="preserve">t</w:t>
+      </w:r>
+      <w:r>
+        <w:t xml:space="preserve"> </w:t>
+      </w:r>
+      <w:r>
+        <w:t xml:space="preserve">estimator, 88 PSMs passed at 5 % FDR.</w:t>
+      </w:r>
+    </w:p>
+    <w:p>
+      <w:pPr>
+        <w:pStyle w:val="BodyText"/>
+      </w:pPr>
+      <w:r>
+        <w:t xml:space="preserve">On the MS1 level, feature detection found 25,613 de-isotoped features across the six files (Table 11, Fig. 7e). Of these, 2,355 (9.2 %) were sampled for MS2 and only 48 (0.19 %) carried a 1 % FDR identification. After ID-free alignment of the three samples, 1,342 consensus features were quantified in all three samples, against a single feature with complete identification-first profiles (Fig. 7f).</w:t>
+      </w:r>
+    </w:p>
+    <w:p>
+      <w:pPr>
+        <w:pStyle w:val="BodyText"/>
+      </w:pPr>
+      <w:r>
+        <w:t xml:space="preserve">These numbers overstate the bottleneck in absolute terms. Our minimal search engine identifies far fewer spectra than production engines (MS-GF+, Comet, Andromeda) with rescoring, and a simple centroid-linking feature finder also counts some noise traces. The direction and the order of magnitude, however, agree with the simulation: most MS1 signal is never identified, and identification-first matrices are dominated by missing values.</w:t>
       </w:r>
     </w:p>
     <w:p>
@@ -9712,13 +10965,1387 @@
           <w:bCs/>
           <w:b/>
         </w:rPr>
+        <w:t xml:space="preserve">Simulation-to-real transfer of de novo sequencing</w:t>
+      </w:r>
+      <w:r>
+        <w:t xml:space="preserve"> </w:t>
+      </w:r>
+      <w:r>
+        <w:t xml:space="preserve">(Table 10, Fig. 7d). Applied zero-shot to 119 real MassIVE-KB HCD spectra, the simulation-trained SpecNovo recovered 7.6 % of peptides (95 % CI 3.4–12.6 %) with amino-acid precision 0.261. The spectrum-graph baseline, which encodes only fragmentation physics, reached 21.8 % (15.1–29.4 %), a substantial sim-to-real gap for the learned model.</w:t>
+      </w:r>
+    </w:p>
+    <w:p>
+      <w:pPr>
+        <w:pStyle w:val="BodyText"/>
+      </w:pPr>
+      <w:r>
+        <w:t xml:space="preserve">Fine-tuning for 800 steps on the corpus re-simulated with the measured b/y statistics doubled SpecNovo’s peptide recall to 15.1 % (9.2–21.8 %; paired difference +7.6 points, 95 % CI +2.5 to +13.4). Amino-acid precision rose to 0.408, and precision–coverage AUC rose to 0.352 (0.215–0.474), on a par with the spectrum graph (0.346, 0.224–0.466). Calibration did not cost simulated performance: peptide recall on the simulated inDB set rose from 0.416 to 0.525, partly from the additional training steps.</w:t>
+      </w:r>
+    </w:p>
+    <w:p>
+      <w:pPr>
+        <w:pStyle w:val="BodyText"/>
+      </w:pPr>
+      <w:r>
+        <w:t xml:space="preserve">On low-resolution ion-trap CID spectra (62 PSMs ≤ 14 residues, 19 peptides), neither the zero-shot nor the HCD-calibrated SpecNovo recovered complete peptides (amino-acid precision 0.105 and 0.144). The spectrum graph, with a 0.5 Da tolerance, recovered 8.1 %. Both de novo approaches therefore remain instrument-specific, and a learned model must be trained on, or calibrated to, the fragmentation mode and mass accuracy it will be applied to.</w:t>
+      </w:r>
+    </w:p>
+    <w:p>
+      <w:pPr>
+        <w:pStyle w:val="BodyText"/>
+      </w:pPr>
+      <w:r>
+        <w:rPr>
+          <w:bCs/>
+          <w:b/>
+        </w:rPr>
+        <w:t xml:space="preserve">Table 10. De novo sequencing of real spectra (95 % bootstrap CI for MassIVE-KB).</w:t>
+      </w:r>
+    </w:p>
+    <w:tbl>
+      <w:tblPr>
+        <w:tblStyle w:val="Table"/>
+        <w:tblW w:type="pct" w:w="5000"/>
+        <w:tblLook w:firstRow="1" w:lastRow="0" w:firstColumn="0" w:lastColumn="0" w:noHBand="0" w:noVBand="0" w:val="0020"/>
+        <w:jc w:val="start"/>
+        <w:tblBorders>
+          <w:top w:val="single" w:sz="12" w:color="000000"/>
+          <w:bottom w:val="single" w:sz="12" w:color="000000"/>
+          <w:insideH w:val="single" w:sz="4" w:color="000000"/>
+        </w:tblBorders>
+      </w:tblPr>
+      <w:tblGrid>
+        <w:gridCol w:w="1320"/>
+        <w:gridCol w:w="1320"/>
+        <w:gridCol w:w="1320"/>
+        <w:gridCol w:w="1320"/>
+        <w:gridCol w:w="1320"/>
+        <w:gridCol w:w="1320"/>
+      </w:tblGrid>
+      <w:tr>
+        <w:trPr>
+          <w:tblHeader w:val="true"/>
+        </w:trPr>
+        <w:tc>
+          <w:tcPr/>
+          <w:p>
+            <w:pPr>
+              <w:pStyle w:val="Compact"/>
+              <w:spacing w:after="20"/>
+              <w:jc w:val="left"/>
+            </w:pPr>
+            <w:r>
+              <w:rPr>
+                <w:rFonts w:ascii="Times New Roman" w:hAnsi="Times New Roman"/>
+                <w:b/>
+                <w:sz w:val="17"/>
+              </w:rPr>
+              <w:t xml:space="preserve">Data</w:t>
+            </w:r>
+          </w:p>
+        </w:tc>
+        <w:tc>
+          <w:tcPr/>
+          <w:p>
+            <w:pPr>
+              <w:pStyle w:val="Compact"/>
+              <w:spacing w:after="20"/>
+              <w:jc w:val="left"/>
+            </w:pPr>
+            <w:r>
+              <w:rPr>
+                <w:rFonts w:ascii="Times New Roman" w:hAnsi="Times New Roman"/>
+                <w:b/>
+                <w:sz w:val="17"/>
+              </w:rPr>
+              <w:t xml:space="preserve">Method</w:t>
+            </w:r>
+          </w:p>
+        </w:tc>
+        <w:tc>
+          <w:tcPr/>
+          <w:p>
+            <w:pPr>
+              <w:pStyle w:val="Compact"/>
+              <w:spacing w:after="20"/>
+              <w:jc w:val="left"/>
+            </w:pPr>
+            <w:r>
+              <w:rPr>
+                <w:rFonts w:ascii="Times New Roman" w:hAnsi="Times New Roman"/>
+                <w:b/>
+                <w:sz w:val="17"/>
+              </w:rPr>
+              <w:t xml:space="preserve">AA precision</w:t>
+            </w:r>
+          </w:p>
+        </w:tc>
+        <w:tc>
+          <w:tcPr/>
+          <w:p>
+            <w:pPr>
+              <w:pStyle w:val="Compact"/>
+              <w:spacing w:after="20"/>
+              <w:jc w:val="left"/>
+            </w:pPr>
+            <w:r>
+              <w:rPr>
+                <w:rFonts w:ascii="Times New Roman" w:hAnsi="Times New Roman"/>
+                <w:b/>
+                <w:sz w:val="17"/>
+              </w:rPr>
+              <w:t xml:space="preserve">AA recall</w:t>
+            </w:r>
+          </w:p>
+        </w:tc>
+        <w:tc>
+          <w:tcPr/>
+          <w:p>
+            <w:pPr>
+              <w:pStyle w:val="Compact"/>
+              <w:spacing w:after="20"/>
+              <w:jc w:val="left"/>
+            </w:pPr>
+            <w:r>
+              <w:rPr>
+                <w:rFonts w:ascii="Times New Roman" w:hAnsi="Times New Roman"/>
+                <w:b/>
+                <w:sz w:val="17"/>
+              </w:rPr>
+              <w:t xml:space="preserve">Peptide recall</w:t>
+            </w:r>
+          </w:p>
+        </w:tc>
+        <w:tc>
+          <w:tcPr/>
+          <w:p>
+            <w:pPr>
+              <w:pStyle w:val="Compact"/>
+              <w:spacing w:after="20"/>
+              <w:jc w:val="left"/>
+            </w:pPr>
+            <w:r>
+              <w:rPr>
+                <w:rFonts w:ascii="Times New Roman" w:hAnsi="Times New Roman"/>
+                <w:b/>
+                <w:sz w:val="17"/>
+              </w:rPr>
+              <w:t xml:space="preserve">PR-AUC</w:t>
+            </w:r>
+          </w:p>
+        </w:tc>
+      </w:tr>
+      <w:tr>
+        <w:tc>
+          <w:tcPr/>
+          <w:p>
+            <w:pPr>
+              <w:pStyle w:val="Compact"/>
+              <w:spacing w:after="20"/>
+              <w:jc w:val="left"/>
+            </w:pPr>
+            <w:r>
+              <w:rPr>
+                <w:rFonts w:ascii="Times New Roman" w:hAnsi="Times New Roman"/>
+                <w:sz w:val="17"/>
+              </w:rPr>
+              <w:t xml:space="preserve">MassIVE-KB HCD (n = 119)</w:t>
+            </w:r>
+          </w:p>
+        </w:tc>
+        <w:tc>
+          <w:tcPr/>
+          <w:p>
+            <w:pPr>
+              <w:pStyle w:val="Compact"/>
+              <w:spacing w:after="20"/>
+              <w:jc w:val="left"/>
+            </w:pPr>
+            <w:r>
+              <w:rPr>
+                <w:rFonts w:ascii="Times New Roman" w:hAnsi="Times New Roman"/>
+                <w:sz w:val="17"/>
+              </w:rPr>
+              <w:t xml:space="preserve">SpectrumGraph-DP</w:t>
+            </w:r>
+          </w:p>
+        </w:tc>
+        <w:tc>
+          <w:tcPr/>
+          <w:p>
+            <w:pPr>
+              <w:pStyle w:val="Compact"/>
+              <w:spacing w:after="20"/>
+              <w:jc w:val="left"/>
+            </w:pPr>
+            <w:r>
+              <w:rPr>
+                <w:rFonts w:ascii="Times New Roman" w:hAnsi="Times New Roman"/>
+                <w:sz w:val="17"/>
+              </w:rPr>
+              <w:t xml:space="preserve">0.593 [0.534–0.651]</w:t>
+            </w:r>
+          </w:p>
+        </w:tc>
+        <w:tc>
+          <w:tcPr/>
+          <w:p>
+            <w:pPr>
+              <w:pStyle w:val="Compact"/>
+              <w:spacing w:after="20"/>
+              <w:jc w:val="left"/>
+            </w:pPr>
+            <w:r>
+              <w:rPr>
+                <w:rFonts w:ascii="Times New Roman" w:hAnsi="Times New Roman"/>
+                <w:sz w:val="17"/>
+              </w:rPr>
+              <w:t xml:space="preserve">0.511</w:t>
+            </w:r>
+          </w:p>
+        </w:tc>
+        <w:tc>
+          <w:tcPr/>
+          <w:p>
+            <w:pPr>
+              <w:pStyle w:val="Compact"/>
+              <w:spacing w:after="20"/>
+              <w:jc w:val="left"/>
+            </w:pPr>
+            <w:r>
+              <w:rPr>
+                <w:rFonts w:ascii="Times New Roman" w:hAnsi="Times New Roman"/>
+                <w:sz w:val="17"/>
+              </w:rPr>
+              <w:t xml:space="preserve">0.218 [0.151–0.294]</w:t>
+            </w:r>
+          </w:p>
+        </w:tc>
+        <w:tc>
+          <w:tcPr/>
+          <w:p>
+            <w:pPr>
+              <w:pStyle w:val="Compact"/>
+              <w:spacing w:after="20"/>
+              <w:jc w:val="left"/>
+            </w:pPr>
+            <w:r>
+              <w:rPr>
+                <w:rFonts w:ascii="Times New Roman" w:hAnsi="Times New Roman"/>
+                <w:sz w:val="17"/>
+              </w:rPr>
+              <w:t xml:space="preserve">0.346 [0.224–0.466]</w:t>
+            </w:r>
+          </w:p>
+        </w:tc>
+      </w:tr>
+      <w:tr>
+        <w:tc>
+          <w:tcPr/>
+          <w:p>
+            <w:pPr>
+              <w:pStyle w:val="Compact"/>
+              <w:spacing w:after="20"/>
+            </w:pPr>
+          </w:p>
+        </w:tc>
+        <w:tc>
+          <w:tcPr/>
+          <w:p>
+            <w:pPr>
+              <w:pStyle w:val="Compact"/>
+              <w:spacing w:after="20"/>
+              <w:jc w:val="left"/>
+            </w:pPr>
+            <w:r>
+              <w:rPr>
+                <w:rFonts w:ascii="Times New Roman" w:hAnsi="Times New Roman"/>
+                <w:sz w:val="17"/>
+              </w:rPr>
+              <w:t xml:space="preserve">SpecNovo, zero-shot (simulation only)</w:t>
+            </w:r>
+          </w:p>
+        </w:tc>
+        <w:tc>
+          <w:tcPr/>
+          <w:p>
+            <w:pPr>
+              <w:pStyle w:val="Compact"/>
+              <w:spacing w:after="20"/>
+              <w:jc w:val="left"/>
+            </w:pPr>
+            <w:r>
+              <w:rPr>
+                <w:rFonts w:ascii="Times New Roman" w:hAnsi="Times New Roman"/>
+                <w:sz w:val="17"/>
+              </w:rPr>
+              <w:t xml:space="preserve">0.261 [0.211–0.313]</w:t>
+            </w:r>
+          </w:p>
+        </w:tc>
+        <w:tc>
+          <w:tcPr/>
+          <w:p>
+            <w:pPr>
+              <w:pStyle w:val="Compact"/>
+              <w:spacing w:after="20"/>
+              <w:jc w:val="left"/>
+            </w:pPr>
+            <w:r>
+              <w:rPr>
+                <w:rFonts w:ascii="Times New Roman" w:hAnsi="Times New Roman"/>
+                <w:sz w:val="17"/>
+              </w:rPr>
+              <w:t xml:space="preserve">0.266</w:t>
+            </w:r>
+          </w:p>
+        </w:tc>
+        <w:tc>
+          <w:tcPr/>
+          <w:p>
+            <w:pPr>
+              <w:pStyle w:val="Compact"/>
+              <w:spacing w:after="20"/>
+              <w:jc w:val="left"/>
+            </w:pPr>
+            <w:r>
+              <w:rPr>
+                <w:rFonts w:ascii="Times New Roman" w:hAnsi="Times New Roman"/>
+                <w:sz w:val="17"/>
+              </w:rPr>
+              <w:t xml:space="preserve">0.076 [0.034–0.126]</w:t>
+            </w:r>
+          </w:p>
+        </w:tc>
+        <w:tc>
+          <w:tcPr/>
+          <w:p>
+            <w:pPr>
+              <w:pStyle w:val="Compact"/>
+              <w:spacing w:after="20"/>
+              <w:jc w:val="left"/>
+            </w:pPr>
+            <w:r>
+              <w:rPr>
+                <w:rFonts w:ascii="Times New Roman" w:hAnsi="Times New Roman"/>
+                <w:sz w:val="17"/>
+              </w:rPr>
+              <w:t xml:space="preserve">0.199 [0.086–0.313]</w:t>
+            </w:r>
+          </w:p>
+        </w:tc>
+      </w:tr>
+      <w:tr>
+        <w:tc>
+          <w:tcPr/>
+          <w:p>
+            <w:pPr>
+              <w:pStyle w:val="Compact"/>
+              <w:spacing w:after="20"/>
+            </w:pPr>
+          </w:p>
+        </w:tc>
+        <w:tc>
+          <w:tcPr/>
+          <w:p>
+            <w:pPr>
+              <w:pStyle w:val="Compact"/>
+              <w:spacing w:after="20"/>
+              <w:jc w:val="left"/>
+            </w:pPr>
+            <w:r>
+              <w:rPr>
+                <w:rFonts w:ascii="Times New Roman" w:hAnsi="Times New Roman"/>
+                <w:sz w:val="17"/>
+              </w:rPr>
+              <w:t xml:space="preserve">SpecNovo, calibrated simulation</w:t>
+            </w:r>
+          </w:p>
+        </w:tc>
+        <w:tc>
+          <w:tcPr/>
+          <w:p>
+            <w:pPr>
+              <w:pStyle w:val="Compact"/>
+              <w:spacing w:after="20"/>
+              <w:jc w:val="left"/>
+            </w:pPr>
+            <w:r>
+              <w:rPr>
+                <w:rFonts w:ascii="Times New Roman" w:hAnsi="Times New Roman"/>
+                <w:sz w:val="17"/>
+              </w:rPr>
+              <w:t xml:space="preserve">0.408 [0.350–0.471]</w:t>
+            </w:r>
+          </w:p>
+        </w:tc>
+        <w:tc>
+          <w:tcPr/>
+          <w:p>
+            <w:pPr>
+              <w:pStyle w:val="Compact"/>
+              <w:spacing w:after="20"/>
+              <w:jc w:val="left"/>
+            </w:pPr>
+            <w:r>
+              <w:rPr>
+                <w:rFonts w:ascii="Times New Roman" w:hAnsi="Times New Roman"/>
+                <w:sz w:val="17"/>
+              </w:rPr>
+              <w:t xml:space="preserve">0.405</w:t>
+            </w:r>
+          </w:p>
+        </w:tc>
+        <w:tc>
+          <w:tcPr/>
+          <w:p>
+            <w:pPr>
+              <w:pStyle w:val="Compact"/>
+              <w:spacing w:after="20"/>
+              <w:jc w:val="left"/>
+            </w:pPr>
+            <w:r>
+              <w:rPr>
+                <w:rFonts w:ascii="Times New Roman" w:hAnsi="Times New Roman"/>
+                <w:sz w:val="17"/>
+              </w:rPr>
+              <w:t xml:space="preserve">0.151 [0.092–0.218]</w:t>
+            </w:r>
+          </w:p>
+        </w:tc>
+        <w:tc>
+          <w:tcPr/>
+          <w:p>
+            <w:pPr>
+              <w:pStyle w:val="Compact"/>
+              <w:spacing w:after="20"/>
+              <w:jc w:val="left"/>
+            </w:pPr>
+            <w:r>
+              <w:rPr>
+                <w:rFonts w:ascii="Times New Roman" w:hAnsi="Times New Roman"/>
+                <w:sz w:val="17"/>
+              </w:rPr>
+              <w:t xml:space="preserve">0.352 [0.215–0.474]</w:t>
+            </w:r>
+          </w:p>
+        </w:tc>
+      </w:tr>
+      <w:tr>
+        <w:tc>
+          <w:tcPr/>
+          <w:p>
+            <w:pPr>
+              <w:pStyle w:val="Compact"/>
+              <w:spacing w:after="20"/>
+              <w:jc w:val="left"/>
+            </w:pPr>
+            <w:r>
+              <w:rPr>
+                <w:rFonts w:ascii="Times New Roman" w:hAnsi="Times New Roman"/>
+                <w:sz w:val="17"/>
+              </w:rPr>
+              <w:t xml:space="preserve">PRIDE BSA ion-trap CID (n = 62)</w:t>
+            </w:r>
+          </w:p>
+        </w:tc>
+        <w:tc>
+          <w:tcPr/>
+          <w:p>
+            <w:pPr>
+              <w:pStyle w:val="Compact"/>
+              <w:spacing w:after="20"/>
+              <w:jc w:val="left"/>
+            </w:pPr>
+            <w:r>
+              <w:rPr>
+                <w:rFonts w:ascii="Times New Roman" w:hAnsi="Times New Roman"/>
+                <w:sz w:val="17"/>
+              </w:rPr>
+              <w:t xml:space="preserve">SpectrumGraph-DP (0.5 Da)</w:t>
+            </w:r>
+          </w:p>
+        </w:tc>
+        <w:tc>
+          <w:tcPr/>
+          <w:p>
+            <w:pPr>
+              <w:pStyle w:val="Compact"/>
+              <w:spacing w:after="20"/>
+              <w:jc w:val="left"/>
+            </w:pPr>
+            <w:r>
+              <w:rPr>
+                <w:rFonts w:ascii="Times New Roman" w:hAnsi="Times New Roman"/>
+                <w:sz w:val="17"/>
+              </w:rPr>
+              <w:t xml:space="preserve">0.292</w:t>
+            </w:r>
+          </w:p>
+        </w:tc>
+        <w:tc>
+          <w:tcPr/>
+          <w:p>
+            <w:pPr>
+              <w:pStyle w:val="Compact"/>
+              <w:spacing w:after="20"/>
+              <w:jc w:val="left"/>
+            </w:pPr>
+            <w:r>
+              <w:rPr>
+                <w:rFonts w:ascii="Times New Roman" w:hAnsi="Times New Roman"/>
+                <w:sz w:val="17"/>
+              </w:rPr>
+              <w:t xml:space="preserve">0.334</w:t>
+            </w:r>
+          </w:p>
+        </w:tc>
+        <w:tc>
+          <w:tcPr/>
+          <w:p>
+            <w:pPr>
+              <w:pStyle w:val="Compact"/>
+              <w:spacing w:after="20"/>
+              <w:jc w:val="left"/>
+            </w:pPr>
+            <w:r>
+              <w:rPr>
+                <w:rFonts w:ascii="Times New Roman" w:hAnsi="Times New Roman"/>
+                <w:sz w:val="17"/>
+              </w:rPr>
+              <w:t xml:space="preserve">0.081</w:t>
+            </w:r>
+          </w:p>
+        </w:tc>
+        <w:tc>
+          <w:tcPr/>
+          <w:p>
+            <w:pPr>
+              <w:pStyle w:val="Compact"/>
+              <w:spacing w:after="20"/>
+              <w:jc w:val="left"/>
+            </w:pPr>
+            <w:r>
+              <w:rPr>
+                <w:rFonts w:ascii="Times New Roman" w:hAnsi="Times New Roman"/>
+                <w:sz w:val="17"/>
+              </w:rPr>
+              <w:t xml:space="preserve">0.113</w:t>
+            </w:r>
+          </w:p>
+        </w:tc>
+      </w:tr>
+      <w:tr>
+        <w:tc>
+          <w:tcPr/>
+          <w:p>
+            <w:pPr>
+              <w:pStyle w:val="Compact"/>
+              <w:spacing w:after="20"/>
+            </w:pPr>
+          </w:p>
+        </w:tc>
+        <w:tc>
+          <w:tcPr/>
+          <w:p>
+            <w:pPr>
+              <w:pStyle w:val="Compact"/>
+              <w:spacing w:after="20"/>
+              <w:jc w:val="left"/>
+            </w:pPr>
+            <w:r>
+              <w:rPr>
+                <w:rFonts w:ascii="Times New Roman" w:hAnsi="Times New Roman"/>
+                <w:sz w:val="17"/>
+              </w:rPr>
+              <w:t xml:space="preserve">SpecNovo, zero-shot</w:t>
+            </w:r>
+          </w:p>
+        </w:tc>
+        <w:tc>
+          <w:tcPr/>
+          <w:p>
+            <w:pPr>
+              <w:pStyle w:val="Compact"/>
+              <w:spacing w:after="20"/>
+              <w:jc w:val="left"/>
+            </w:pPr>
+            <w:r>
+              <w:rPr>
+                <w:rFonts w:ascii="Times New Roman" w:hAnsi="Times New Roman"/>
+                <w:sz w:val="17"/>
+              </w:rPr>
+              <w:t xml:space="preserve">0.105</w:t>
+            </w:r>
+          </w:p>
+        </w:tc>
+        <w:tc>
+          <w:tcPr/>
+          <w:p>
+            <w:pPr>
+              <w:pStyle w:val="Compact"/>
+              <w:spacing w:after="20"/>
+              <w:jc w:val="left"/>
+            </w:pPr>
+            <w:r>
+              <w:rPr>
+                <w:rFonts w:ascii="Times New Roman" w:hAnsi="Times New Roman"/>
+                <w:sz w:val="17"/>
+              </w:rPr>
+              <w:t xml:space="preserve">0.116</w:t>
+            </w:r>
+          </w:p>
+        </w:tc>
+        <w:tc>
+          <w:tcPr/>
+          <w:p>
+            <w:pPr>
+              <w:pStyle w:val="Compact"/>
+              <w:spacing w:after="20"/>
+              <w:jc w:val="left"/>
+            </w:pPr>
+            <w:r>
+              <w:rPr>
+                <w:rFonts w:ascii="Times New Roman" w:hAnsi="Times New Roman"/>
+                <w:sz w:val="17"/>
+              </w:rPr>
+              <w:t xml:space="preserve">0.000</w:t>
+            </w:r>
+          </w:p>
+        </w:tc>
+        <w:tc>
+          <w:tcPr/>
+          <w:p>
+            <w:pPr>
+              <w:pStyle w:val="Compact"/>
+              <w:spacing w:after="20"/>
+              <w:jc w:val="left"/>
+            </w:pPr>
+            <w:r>
+              <w:rPr>
+                <w:rFonts w:ascii="Times New Roman" w:hAnsi="Times New Roman"/>
+                <w:sz w:val="17"/>
+              </w:rPr>
+              <w:t xml:space="preserve">0.000</w:t>
+            </w:r>
+          </w:p>
+        </w:tc>
+      </w:tr>
+      <w:tr>
+        <w:tc>
+          <w:tcPr/>
+          <w:p>
+            <w:pPr>
+              <w:pStyle w:val="Compact"/>
+              <w:spacing w:after="20"/>
+            </w:pPr>
+          </w:p>
+        </w:tc>
+        <w:tc>
+          <w:tcPr/>
+          <w:p>
+            <w:pPr>
+              <w:pStyle w:val="Compact"/>
+              <w:spacing w:after="20"/>
+              <w:jc w:val="left"/>
+            </w:pPr>
+            <w:r>
+              <w:rPr>
+                <w:rFonts w:ascii="Times New Roman" w:hAnsi="Times New Roman"/>
+                <w:sz w:val="17"/>
+              </w:rPr>
+              <w:t xml:space="preserve">SpecNovo, calibrated (HCD)</w:t>
+            </w:r>
+          </w:p>
+        </w:tc>
+        <w:tc>
+          <w:tcPr/>
+          <w:p>
+            <w:pPr>
+              <w:pStyle w:val="Compact"/>
+              <w:spacing w:after="20"/>
+              <w:jc w:val="left"/>
+            </w:pPr>
+            <w:r>
+              <w:rPr>
+                <w:rFonts w:ascii="Times New Roman" w:hAnsi="Times New Roman"/>
+                <w:sz w:val="17"/>
+              </w:rPr>
+              <w:t xml:space="preserve">0.144</w:t>
+            </w:r>
+          </w:p>
+        </w:tc>
+        <w:tc>
+          <w:tcPr/>
+          <w:p>
+            <w:pPr>
+              <w:pStyle w:val="Compact"/>
+              <w:spacing w:after="20"/>
+              <w:jc w:val="left"/>
+            </w:pPr>
+            <w:r>
+              <w:rPr>
+                <w:rFonts w:ascii="Times New Roman" w:hAnsi="Times New Roman"/>
+                <w:sz w:val="17"/>
+              </w:rPr>
+              <w:t xml:space="preserve">0.154</w:t>
+            </w:r>
+          </w:p>
+        </w:tc>
+        <w:tc>
+          <w:tcPr/>
+          <w:p>
+            <w:pPr>
+              <w:pStyle w:val="Compact"/>
+              <w:spacing w:after="20"/>
+              <w:jc w:val="left"/>
+            </w:pPr>
+            <w:r>
+              <w:rPr>
+                <w:rFonts w:ascii="Times New Roman" w:hAnsi="Times New Roman"/>
+                <w:sz w:val="17"/>
+              </w:rPr>
+              <w:t xml:space="preserve">0.000</w:t>
+            </w:r>
+          </w:p>
+        </w:tc>
+        <w:tc>
+          <w:tcPr/>
+          <w:p>
+            <w:pPr>
+              <w:pStyle w:val="Compact"/>
+              <w:spacing w:after="20"/>
+              <w:jc w:val="left"/>
+            </w:pPr>
+            <w:r>
+              <w:rPr>
+                <w:rFonts w:ascii="Times New Roman" w:hAnsi="Times New Roman"/>
+                <w:sz w:val="17"/>
+              </w:rPr>
+              <w:t xml:space="preserve">0.000</w:t>
+            </w:r>
+          </w:p>
+        </w:tc>
+      </w:tr>
+    </w:tbl>
+    <w:p>
+      <w:pPr>
+        <w:pStyle w:val="BodyText"/>
+      </w:pPr>
+      <w:r>
+        <w:rPr>
+          <w:bCs/>
+          <w:b/>
+        </w:rPr>
+        <w:t xml:space="preserve">Table 11. The identification bottleneck on real PRIDE-derived LC-MS runs (three BSA samples × two RT fractions).</w:t>
+      </w:r>
+    </w:p>
+    <w:tbl>
+      <w:tblPr>
+        <w:tblStyle w:val="Table"/>
+        <w:tblW w:type="pct" w:w="5000"/>
+        <w:tblLook w:firstRow="1" w:lastRow="0" w:firstColumn="0" w:lastColumn="0" w:noHBand="0" w:noVBand="0" w:val="0020"/>
+        <w:jc w:val="start"/>
+        <w:tblBorders>
+          <w:top w:val="single" w:sz="12" w:color="000000"/>
+          <w:bottom w:val="single" w:sz="12" w:color="000000"/>
+          <w:insideH w:val="single" w:sz="4" w:color="000000"/>
+        </w:tblBorders>
+      </w:tblPr>
+      <w:tblGrid>
+        <w:gridCol w:w="3960"/>
+        <w:gridCol w:w="3960"/>
+      </w:tblGrid>
+      <w:tr>
+        <w:trPr>
+          <w:tblHeader w:val="true"/>
+        </w:trPr>
+        <w:tc>
+          <w:tcPr/>
+          <w:p>
+            <w:pPr>
+              <w:pStyle w:val="Compact"/>
+              <w:spacing w:after="20"/>
+              <w:jc w:val="left"/>
+            </w:pPr>
+            <w:r>
+              <w:rPr>
+                <w:rFonts w:ascii="Times New Roman" w:hAnsi="Times New Roman"/>
+                <w:b/>
+                <w:sz w:val="17"/>
+              </w:rPr>
+              <w:t xml:space="preserve">Quantity</w:t>
+            </w:r>
+          </w:p>
+        </w:tc>
+        <w:tc>
+          <w:tcPr/>
+          <w:p>
+            <w:pPr>
+              <w:pStyle w:val="Compact"/>
+              <w:spacing w:after="20"/>
+              <w:jc w:val="left"/>
+            </w:pPr>
+            <w:r>
+              <w:rPr>
+                <w:rFonts w:ascii="Times New Roman" w:hAnsi="Times New Roman"/>
+                <w:b/>
+                <w:sz w:val="17"/>
+              </w:rPr>
+              <w:t xml:space="preserve">Value</w:t>
+            </w:r>
+          </w:p>
+        </w:tc>
+      </w:tr>
+      <w:tr>
+        <w:tc>
+          <w:tcPr/>
+          <w:p>
+            <w:pPr>
+              <w:pStyle w:val="Compact"/>
+              <w:spacing w:after="20"/>
+              <w:jc w:val="left"/>
+            </w:pPr>
+            <w:r>
+              <w:rPr>
+                <w:rFonts w:ascii="Times New Roman" w:hAnsi="Times New Roman"/>
+                <w:sz w:val="17"/>
+              </w:rPr>
+              <w:t xml:space="preserve">MS2 spectra / MS1 scans</w:t>
+            </w:r>
+          </w:p>
+        </w:tc>
+        <w:tc>
+          <w:tcPr/>
+          <w:p>
+            <w:pPr>
+              <w:pStyle w:val="Compact"/>
+              <w:spacing w:after="20"/>
+              <w:jc w:val="left"/>
+            </w:pPr>
+            <w:r>
+              <w:rPr>
+                <w:rFonts w:ascii="Times New Roman" w:hAnsi="Times New Roman"/>
+                <w:sz w:val="17"/>
+              </w:rPr>
+              <w:t xml:space="preserve">3,135 / 1,676</w:t>
+            </w:r>
+          </w:p>
+        </w:tc>
+      </w:tr>
+      <w:tr>
+        <w:tc>
+          <w:tcPr/>
+          <w:p>
+            <w:pPr>
+              <w:pStyle w:val="Compact"/>
+              <w:spacing w:after="20"/>
+              <w:jc w:val="left"/>
+            </w:pPr>
+            <w:r>
+              <w:rPr>
+                <w:rFonts w:ascii="Times New Roman" w:hAnsi="Times New Roman"/>
+                <w:sz w:val="17"/>
+              </w:rPr>
+              <w:t xml:space="preserve">Target + decoy database entries</w:t>
+            </w:r>
+          </w:p>
+        </w:tc>
+        <w:tc>
+          <w:tcPr/>
+          <w:p>
+            <w:pPr>
+              <w:pStyle w:val="Compact"/>
+              <w:spacing w:after="20"/>
+              <w:jc w:val="left"/>
+            </w:pPr>
+            <w:r>
+              <w:rPr>
+                <w:rFonts w:ascii="Times New Roman" w:hAnsi="Times New Roman"/>
+                <w:sz w:val="17"/>
+              </w:rPr>
+              <w:t xml:space="preserve">1,725,026</w:t>
+            </w:r>
+          </w:p>
+        </w:tc>
+      </w:tr>
+      <w:tr>
+        <w:tc>
+          <w:tcPr/>
+          <w:p>
+            <w:pPr>
+              <w:pStyle w:val="Compact"/>
+              <w:spacing w:after="20"/>
+              <w:jc w:val="left"/>
+            </w:pPr>
+            <w:r>
+              <w:rPr>
+                <w:rFonts w:ascii="Times New Roman" w:hAnsi="Times New Roman"/>
+                <w:sz w:val="17"/>
+              </w:rPr>
+              <w:t xml:space="preserve">PSMs at 1 % FDR (unique peptides)</w:t>
+            </w:r>
+          </w:p>
+        </w:tc>
+        <w:tc>
+          <w:tcPr/>
+          <w:p>
+            <w:pPr>
+              <w:pStyle w:val="Compact"/>
+              <w:spacing w:after="20"/>
+              <w:jc w:val="left"/>
+            </w:pPr>
+            <w:r>
+              <w:rPr>
+                <w:rFonts w:ascii="Times New Roman" w:hAnsi="Times New Roman"/>
+                <w:sz w:val="17"/>
+              </w:rPr>
+              <w:t xml:space="preserve">64 (20); 2.0 % of MS2 spectra</w:t>
+            </w:r>
+          </w:p>
+        </w:tc>
+      </w:tr>
+      <w:tr>
+        <w:tc>
+          <w:tcPr/>
+          <w:p>
+            <w:pPr>
+              <w:pStyle w:val="Compact"/>
+              <w:spacing w:after="20"/>
+              <w:jc w:val="left"/>
+            </w:pPr>
+            <w:r>
+              <w:rPr>
+                <w:rFonts w:ascii="Times New Roman" w:hAnsi="Times New Roman"/>
+                <w:sz w:val="17"/>
+              </w:rPr>
+              <w:t xml:space="preserve">De-isotoped MS1 features (six files)</w:t>
+            </w:r>
+          </w:p>
+        </w:tc>
+        <w:tc>
+          <w:tcPr/>
+          <w:p>
+            <w:pPr>
+              <w:pStyle w:val="Compact"/>
+              <w:spacing w:after="20"/>
+              <w:jc w:val="left"/>
+            </w:pPr>
+            <w:r>
+              <w:rPr>
+                <w:rFonts w:ascii="Times New Roman" w:hAnsi="Times New Roman"/>
+                <w:sz w:val="17"/>
+              </w:rPr>
+              <w:t xml:space="preserve">25,613</w:t>
+            </w:r>
+          </w:p>
+        </w:tc>
+      </w:tr>
+      <w:tr>
+        <w:tc>
+          <w:tcPr/>
+          <w:p>
+            <w:pPr>
+              <w:pStyle w:val="Compact"/>
+              <w:spacing w:after="20"/>
+              <w:jc w:val="left"/>
+            </w:pPr>
+            <w:r>
+              <w:rPr>
+                <w:rFonts w:ascii="Times New Roman" w:hAnsi="Times New Roman"/>
+                <w:sz w:val="17"/>
+              </w:rPr>
+              <w:t xml:space="preserve">Features sampled for MS2</w:t>
+            </w:r>
+          </w:p>
+        </w:tc>
+        <w:tc>
+          <w:tcPr/>
+          <w:p>
+            <w:pPr>
+              <w:pStyle w:val="Compact"/>
+              <w:spacing w:after="20"/>
+              <w:jc w:val="left"/>
+            </w:pPr>
+            <w:r>
+              <w:rPr>
+                <w:rFonts w:ascii="Times New Roman" w:hAnsi="Times New Roman"/>
+                <w:sz w:val="17"/>
+              </w:rPr>
+              <w:t xml:space="preserve">2,355 (9.2 %)</w:t>
+            </w:r>
+          </w:p>
+        </w:tc>
+      </w:tr>
+      <w:tr>
+        <w:tc>
+          <w:tcPr/>
+          <w:p>
+            <w:pPr>
+              <w:pStyle w:val="Compact"/>
+              <w:spacing w:after="20"/>
+              <w:jc w:val="left"/>
+            </w:pPr>
+            <w:r>
+              <w:rPr>
+                <w:rFonts w:ascii="Times New Roman" w:hAnsi="Times New Roman"/>
+                <w:sz w:val="17"/>
+              </w:rPr>
+              <w:t xml:space="preserve">Features with a 1 % FDR identification</w:t>
+            </w:r>
+          </w:p>
+        </w:tc>
+        <w:tc>
+          <w:tcPr/>
+          <w:p>
+            <w:pPr>
+              <w:pStyle w:val="Compact"/>
+              <w:spacing w:after="20"/>
+              <w:jc w:val="left"/>
+            </w:pPr>
+            <w:r>
+              <w:rPr>
+                <w:rFonts w:ascii="Times New Roman" w:hAnsi="Times New Roman"/>
+                <w:sz w:val="17"/>
+              </w:rPr>
+              <w:t xml:space="preserve">48 (0.19 %)</w:t>
+            </w:r>
+          </w:p>
+        </w:tc>
+      </w:tr>
+      <w:tr>
+        <w:tc>
+          <w:tcPr/>
+          <w:p>
+            <w:pPr>
+              <w:pStyle w:val="Compact"/>
+              <w:spacing w:after="20"/>
+              <w:jc w:val="left"/>
+            </w:pPr>
+            <w:r>
+              <w:rPr>
+                <w:rFonts w:ascii="Times New Roman" w:hAnsi="Times New Roman"/>
+                <w:sz w:val="17"/>
+              </w:rPr>
+              <w:t xml:space="preserve">Consensus features after ID-free alignment</w:t>
+            </w:r>
+          </w:p>
+        </w:tc>
+        <w:tc>
+          <w:tcPr/>
+          <w:p>
+            <w:pPr>
+              <w:pStyle w:val="Compact"/>
+              <w:spacing w:after="20"/>
+              <w:jc w:val="left"/>
+            </w:pPr>
+            <w:r>
+              <w:rPr>
+                <w:rFonts w:ascii="Times New Roman" w:hAnsi="Times New Roman"/>
+                <w:sz w:val="17"/>
+              </w:rPr>
+              <w:t xml:space="preserve">18,636</w:t>
+            </w:r>
+          </w:p>
+        </w:tc>
+      </w:tr>
+      <w:tr>
+        <w:tc>
+          <w:tcPr/>
+          <w:p>
+            <w:pPr>
+              <w:pStyle w:val="Compact"/>
+              <w:spacing w:after="20"/>
+              <w:jc w:val="left"/>
+            </w:pPr>
+            <w:r>
+              <w:rPr>
+                <w:rFonts w:ascii="Times New Roman" w:hAnsi="Times New Roman"/>
+                <w:sz w:val="17"/>
+              </w:rPr>
+              <w:t xml:space="preserve">Quantified in all three samples: ID-free / ID-first</w:t>
+            </w:r>
+          </w:p>
+        </w:tc>
+        <w:tc>
+          <w:tcPr/>
+          <w:p>
+            <w:pPr>
+              <w:pStyle w:val="Compact"/>
+              <w:spacing w:after="20"/>
+              <w:jc w:val="left"/>
+            </w:pPr>
+            <w:r>
+              <w:rPr>
+                <w:rFonts w:ascii="Times New Roman" w:hAnsi="Times New Roman"/>
+                <w:sz w:val="17"/>
+              </w:rPr>
+              <w:t xml:space="preserve">1,342 / 1</w:t>
+            </w:r>
+          </w:p>
+        </w:tc>
+      </w:tr>
+      <w:tr>
+        <w:tc>
+          <w:tcPr/>
+          <w:p>
+            <w:pPr>
+              <w:pStyle w:val="Compact"/>
+              <w:spacing w:after="20"/>
+              <w:jc w:val="left"/>
+            </w:pPr>
+            <w:r>
+              <w:rPr>
+                <w:rFonts w:ascii="Times New Roman" w:hAnsi="Times New Roman"/>
+                <w:sz w:val="17"/>
+              </w:rPr>
+              <w:t xml:space="preserve">Missing values: ID-free (all features) / ID-first (identified features)</w:t>
+            </w:r>
+          </w:p>
+        </w:tc>
+        <w:tc>
+          <w:tcPr/>
+          <w:p>
+            <w:pPr>
+              <w:pStyle w:val="Compact"/>
+              <w:spacing w:after="20"/>
+              <w:jc w:val="left"/>
+            </w:pPr>
+            <w:r>
+              <w:rPr>
+                <w:rFonts w:ascii="Times New Roman" w:hAnsi="Times New Roman"/>
+                <w:sz w:val="17"/>
+              </w:rPr>
+              <w:t xml:space="preserve">54.2 % / 55.6 %</w:t>
+            </w:r>
+          </w:p>
+        </w:tc>
+      </w:tr>
+      <w:tr>
+        <w:tc>
+          <w:tcPr/>
+          <w:p>
+            <w:pPr>
+              <w:pStyle w:val="Compact"/>
+              <w:spacing w:after="20"/>
+              <w:jc w:val="left"/>
+            </w:pPr>
+            <w:r>
+              <w:rPr>
+                <w:rFonts w:ascii="Times New Roman" w:hAnsi="Times New Roman"/>
+                <w:sz w:val="17"/>
+              </w:rPr>
+              <w:t xml:space="preserve">Pearson r of log-intensities between samples (ID-free, complete features)</w:t>
+            </w:r>
+          </w:p>
+        </w:tc>
+        <w:tc>
+          <w:tcPr/>
+          <w:p>
+            <w:pPr>
+              <w:pStyle w:val="Compact"/>
+              <w:spacing w:after="20"/>
+              <w:jc w:val="left"/>
+            </w:pPr>
+            <w:r>
+              <w:rPr>
+                <w:rFonts w:ascii="Times New Roman" w:hAnsi="Times New Roman"/>
+                <w:sz w:val="17"/>
+              </w:rPr>
+              <w:t xml:space="preserve">0.44–0.64</w:t>
+            </w:r>
+          </w:p>
+        </w:tc>
+      </w:tr>
+    </w:tbl>
+    <w:p>
+      <w:pPr>
+        <w:pStyle w:val="CaptionedFigure"/>
+      </w:pPr>
+      <w:r>
+        <w:drawing>
+          <wp:inline>
+            <wp:extent cx="5334000" cy="4917675"/>
+            <wp:effectExtent b="0" l="0" r="0" t="0"/>
+            <wp:docPr descr="Fig. 7. Validation on real PRIDE and MassIVE-KB data. (a) Real annotated MassIVE-KB HCD spectrum (b ions blue, y ions red). (b) Target and decoy score distributions for the PRIDE BSA ion-trap search (log scale). (c) Fragmentation statistics of the default simulator against real HCD and CID spectra (median and IQR; ratios divided by 4 for display). (d) De novo sequencing of 119 real HCD spectra: amino-acid precision (light) and peptide recall (dark) for the spectrum-graph baseline, zero-shot SpecNovo and SpecNovo fine-tuned on calibrated simulation. (e) Identification funnel on real MS1 data: detected features, features sampled for MS2 and features with a 1 % FDR identification. (f) Number of features quantified in all three samples with identification-free and identification-first workflows." title="" id="55" name="Picture"/>
+            <a:graphic>
+              <a:graphicData uri="http://schemas.openxmlformats.org/drawingml/2006/picture">
+                <pic:pic>
+                  <pic:nvPicPr>
+                    <pic:cNvPr descr="../figures/fig7_real_validation.png" id="56" name="Picture"/>
+                    <pic:cNvPicPr>
+                      <a:picLocks noChangeArrowheads="1" noChangeAspect="1"/>
+                    </pic:cNvPicPr>
+                  </pic:nvPicPr>
+                  <pic:blipFill>
+                    <a:blip r:embed="rId54"/>
+                    <a:stretch>
+                      <a:fillRect/>
+                    </a:stretch>
+                  </pic:blipFill>
+                  <pic:spPr bwMode="auto">
+                    <a:xfrm>
+                      <a:off x="0" y="0"/>
+                      <a:ext cx="5334000" cy="4917675"/>
+                    </a:xfrm>
+                    <a:prstGeom prst="rect">
+                      <a:avLst/>
+                    </a:prstGeom>
+                    <a:noFill/>
+                    <a:ln w="9525">
+                      <a:noFill/>
+                      <a:headEnd/>
+                      <a:tailEnd/>
+                    </a:ln>
+                  </pic:spPr>
+                </pic:pic>
+              </a:graphicData>
+            </a:graphic>
+          </wp:inline>
+        </w:drawing>
+      </w:r>
+    </w:p>
+    <w:p>
+      <w:pPr>
+        <w:pStyle w:val="ImageCaption"/>
+      </w:pPr>
+      <w:r>
+        <w:rPr>
+          <w:bCs/>
+          <w:b/>
+        </w:rPr>
+        <w:t xml:space="preserve">Fig. 7. Validation on real PRIDE and MassIVE-KB data.</w:t>
+      </w:r>
+      <w:r>
+        <w:t xml:space="preserve"> </w:t>
+      </w:r>
+      <w:r>
+        <w:t xml:space="preserve">(a) Real annotated MassIVE-KB HCD spectrum (b ions blue, y ions red). (b) Target and decoy score distributions for the PRIDE BSA ion-trap search (log scale). (c) Fragmentation statistics of the default simulator against real HCD and CID spectra (median and IQR; ratios divided by 4 for display). (d) De novo sequencing of 119 real HCD spectra: amino-acid precision (light) and peptide recall (dark) for the spectrum-graph baseline, zero-shot SpecNovo and SpecNovo fine-tuned on calibrated simulation. (e) Identification funnel on real MS1 data: detected features, features sampled for MS2 and features with a 1 % FDR identification. (f) Number of features quantified in all three samples with identification-free and identification-first workflows.</w:t>
+      </w:r>
+    </w:p>
+    <w:bookmarkEnd w:id="57"/>
+    <w:bookmarkEnd w:id="58"/>
+    <w:bookmarkStart w:id="59" w:name="discussion"/>
+    <w:p>
+      <w:pPr>
+        <w:pStyle w:val="Heading1"/>
+      </w:pPr>
+      <w:r>
+        <w:rPr>
+          <w:color w:val="1F2A44"/>
+        </w:rPr>
+        <w:t xml:space="preserve">Discussion</w:t>
+      </w:r>
+    </w:p>
+    <w:p>
+      <w:pPr>
+        <w:pStyle w:val="FirstParagraph"/>
+      </w:pPr>
+      <w:r>
+        <w:t xml:space="preserve">The move from identification-first to spectrum-native proteomics is often framed as a contest between classical algorithms and deep learning. The controlled measurements here suggest a more useful framing:</w:t>
+      </w:r>
+      <w:r>
+        <w:t xml:space="preserve"> </w:t>
+      </w:r>
+      <w:r>
+        <w:rPr>
+          <w:bCs/>
+          <w:b/>
+        </w:rPr>
+        <w:t xml:space="preserve">identification is an information bottleneck, and the main gains come from removing that bottleneck.</w:t>
+      </w:r>
+      <w:r>
+        <w:t xml:space="preserve"> </w:t>
+      </w:r>
+      <w:r>
+        <w:t xml:space="preserve">The choice of model class matters less.</w:t>
+      </w:r>
+    </w:p>
+    <w:p>
+      <w:pPr>
+        <w:pStyle w:val="BodyText"/>
+      </w:pPr>
+      <w:r>
+        <w:t xml:space="preserve">On the MS1 side, the bottleneck alone accounts for a 0.33 AUROC difference at n = 192 (0.648 vs 0.975), and it grows with the size of the dark proteome. This mirrors the ProFormer observation that identification-free MS1 classification is both faster and more accurate than interpretation-based workflows [17]. It also explains why match-between-runs is so valuable in practice [2]: MBR recovers the missing values, but not the biomarkers that were never identified.</w:t>
+      </w:r>
+    </w:p>
+    <w:p>
+      <w:pPr>
+        <w:pStyle w:val="BodyText"/>
+      </w:pPr>
+      <w:r>
+        <w:t xml:space="preserve">On the MS2 side, database search remains unbeatable for canonical peptides but recovers nothing beyond its database. De novo sequencing provides access to variant and novel sequences at a fixed, database-independent rate, which matters for immunopeptidomics, metaproteomics, antibody sequencing and proteogenomic variant detection [9,10].</w:t>
+      </w:r>
+    </w:p>
+    <w:p>
+      <w:pPr>
+        <w:pStyle w:val="BodyText"/>
+      </w:pPr>
+      <w:r>
+        <w:t xml:space="preserve">The second lesson concerns</w:t>
+      </w:r>
+      <w:r>
+        <w:t xml:space="preserve"> </w:t>
+      </w:r>
+      <w:r>
+        <w:rPr>
+          <w:bCs/>
+          <w:b/>
+        </w:rPr>
+        <w:t xml:space="preserve">data efficiency</w:t>
+      </w:r>
+      <w:r>
+        <w:t xml:space="preserve">. A generic sequence-to-sequence transformer trained on ≈ 0.45 M spectra learned a sequence language model but not spectrum interpretation, and was useless under mass-constrained decoding. A small, physics-informed ion-evidence term, analogous to the ion-location features of DeepNovo [15] and to pairwise mass-difference attention [13], made the same architecture competitive within a few hundred additional optimisation steps.</w:t>
+      </w:r>
+    </w:p>
+    <w:p>
+      <w:pPr>
+        <w:pStyle w:val="BodyText"/>
+      </w:pPr>
+      <w:r>
+        <w:t xml:space="preserve">This result is directly relevant to the vision of proteomics GPTs trained on MassNet-style corpora. Corpus scale and inductive bias are substitutes, and at the scales available to most laboratories, inductive bias is cheaper. Conversely, the gap between our CPU-scale model and published models trained on tens of millions of spectra [9,10] is consistent with data scaling, not architectural limits, being the main driver of state-of-the-art de novo accuracy.</w:t>
+      </w:r>
+    </w:p>
+    <w:p>
+      <w:pPr>
+        <w:pStyle w:val="BodyText"/>
+      </w:pPr>
+      <w:r>
+        <w:t xml:space="preserve">Third,</w:t>
+      </w:r>
+      <w:r>
+        <w:t xml:space="preserve"> </w:t>
+      </w:r>
+      <w:r>
+        <w:rPr>
+          <w:bCs/>
+          <w:b/>
+        </w:rPr>
+        <w:t xml:space="preserve">self-supervised pretraining is not a free lunch at small scale.</w:t>
+      </w:r>
+      <w:r>
+        <w:t xml:space="preserve"> </w:t>
+      </w:r>
+      <w:r>
+        <w:t xml:space="preserve">Masked-intensity pretraining on 800 unlabeled runs did not improve in-distribution phenotype prediction, but it consistently improved cross-site transfer and reduced variance. This pattern is expected if pretraining learns site-invariant co-abundance structure rather than phenotype-specific signal. It suggests that the payoff of corpus-scale pretraining will appear first in robustness and transfer across instruments, laboratories and cohorts.</w:t>
+      </w:r>
+    </w:p>
+    <w:p>
+      <w:pPr>
+        <w:pStyle w:val="BodyText"/>
+      </w:pPr>
+      <w:r>
+        <w:rPr>
+          <w:bCs/>
+          <w:b/>
+        </w:rPr>
         <w:t xml:space="preserve">Limitations.</w:t>
       </w:r>
       <w:r>
         <w:t xml:space="preserve"> </w:t>
       </w:r>
       <w:r>
-        <w:t xml:space="preserve">All conclusions are drawn from simulation. The virtual instrument omits several features of real data:</w:t>
+        <w:t xml:space="preserve">The central comparisons are drawn from simulation. The real-data validation is deliberately small: 3,135 PRIDE-derived MS2 spectra and 119 MassIVE-KB spectra, obtained from public mirrors because the PRIDE archive itself could not be reached from the compute environment. It used a minimal search engine and feature finder, and it could not test phenotype prediction, which requires labelled cohorts of tens to hundreds of runs. The real data nonetheless show that the default virtual instrument overestimates b-ion completeness and that learned de novo models suffer a substantial sim-to-real gap, which calibration halves but does not close. The virtual instrument also omits several features of real data:</w:t>
       </w:r>
     </w:p>
     <w:p>
@@ -9818,7 +12445,7 @@
         <w:pStyle w:val="Compact"/>
       </w:pPr>
       <w:r>
-        <w:t xml:space="preserve">calibrate the simulator against real PSMs (e.g., MassIVE-KB [7]);</w:t>
+        <w:t xml:space="preserve">extend the calibration loop demonstrated here to full MassIVE-KB/PRIDE reprocessing results (e.g., via quantms [31]), including ion-trap CID;</w:t>
       </w:r>
     </w:p>
     <w:p>
@@ -9830,7 +12457,7 @@
         <w:pStyle w:val="Compact"/>
       </w:pPr>
       <w:r>
-        <w:t xml:space="preserve">add DIA multiplexing;</w:t>
+        <w:t xml:space="preserve">validate spectrum-to-phenotype models on labelled PRIDE cohorts annotated with SDRF [32];</w:t>
       </w:r>
     </w:p>
     <w:p>
@@ -9842,7 +12469,7 @@
         <w:pStyle w:val="Compact"/>
       </w:pPr>
       <w:r>
-        <w:t xml:space="preserve">benchmark published models (Casanovo, InstaNovo, ProFormer) inside the same controlled environment;</w:t>
+        <w:t xml:space="preserve">add DIA multiplexing;</w:t>
       </w:r>
     </w:p>
     <w:p>
@@ -9854,11 +12481,23 @@
         <w:pStyle w:val="Compact"/>
       </w:pPr>
       <w:r>
+        <w:t xml:space="preserve">benchmark published models (Casanovo, InstaNovo, ProFormer) inside the same controlled environment;</w:t>
+      </w:r>
+    </w:p>
+    <w:p>
+      <w:pPr>
+        <w:numPr>
+          <w:ilvl w:val="0"/>
+          <w:numId w:val="1004"/>
+        </w:numPr>
+        <w:pStyle w:val="Compact"/>
+      </w:pPr>
+      <w:r>
         <w:t xml:space="preserve">scale SSL corpora by orders of magnitude.</w:t>
       </w:r>
     </w:p>
-    <w:bookmarkEnd w:id="54"/>
-    <w:bookmarkStart w:id="55" w:name="conclusions"/>
+    <w:bookmarkEnd w:id="59"/>
+    <w:bookmarkStart w:id="60" w:name="conclusions"/>
     <w:p>
       <w:pPr>
         <w:pStyle w:val="Heading1"/>
@@ -9924,14 +12563,36 @@
     </w:p>
     <w:p>
       <w:pPr>
+        <w:numPr>
+          <w:ilvl w:val="0"/>
+          <w:numId w:val="1005"/>
+        </w:numPr>
+        <w:pStyle w:val="Compact"/>
+      </w:pPr>
+      <w:r>
+        <w:rPr>
+          <w:bCs/>
+          <w:b/>
+        </w:rPr>
+        <w:t xml:space="preserve">Real data.</w:t>
+      </w:r>
+      <w:r>
+        <w:t xml:space="preserve"> </w:t>
+      </w:r>
+      <w:r>
+        <w:t xml:space="preserve">On PRIDE-derived runs only 0.19 % of MS1 features and 2.0 % of MS2 spectra were identified by a minimal engine, confirming the bottleneck. On real HCD spectra, calibrating the simulator to measured fragmentation statistics doubled the learned model’s peptide recall (7.6 % → 15.1 %) and matched the spectrum-graph baseline in precision–coverage AUC.</w:t>
+      </w:r>
+    </w:p>
+    <w:p>
+      <w:pPr>
         <w:pStyle w:val="FirstParagraph"/>
       </w:pPr>
       <w:r>
         <w:t xml:space="preserve">These measurements support continued investment in large, shared, machine-learning-ready spectral corpora, and in hybrid models that unite learned representations with the physics of peptide fragmentation.</w:t>
       </w:r>
     </w:p>
-    <w:bookmarkEnd w:id="55"/>
-    <w:bookmarkStart w:id="56" w:name="data-and-code-availability"/>
+    <w:bookmarkEnd w:id="60"/>
+    <w:bookmarkStart w:id="61" w:name="data-and-code-availability"/>
     <w:p>
       <w:pPr>
         <w:pStyle w:val="Heading1"/>
@@ -9948,7 +12609,7 @@
         <w:pStyle w:val="FirstParagraph"/>
       </w:pPr>
       <w:r>
-        <w:t xml:space="preserve">All source code (simulator, models, baselines, evaluation and figure scripts), result files (JSON/pickle), trained model checkpoints and figures are available in the project repository (</w:t>
+        <w:t xml:space="preserve">All source code (simulator, models, baselines, real-data validation, evaluation and figure scripts), result files (JSON/pickle), trained model checkpoints and figures are available in the project repository (</w:t>
       </w:r>
       <w:r>
         <w:rPr>
@@ -9957,11 +12618,29 @@
         <w:t xml:space="preserve">spectrum_native_proteomics/</w:t>
       </w:r>
       <w:r>
-        <w:t xml:space="preserve">). Every experiment is reproducible on a CPU with Python ≥ 3.11, PyTorch ≥ 2.0, NumPy, SciPy, scikit-learn, pyteomics and matplotlib, using the commands listed in the repository README.</w:t>
-      </w:r>
-    </w:p>
-    <w:bookmarkEnd w:id="56"/>
-    <w:bookmarkStart w:id="57" w:name="funding"/>
+        <w:t xml:space="preserve">). Every experiment is reproducible on a CPU with Python ≥ 3.11, PyTorch ≥ 2.0, NumPy, SciPy, scikit-learn, pyteomics and matplotlib, using the commands listed in the repository README. Real data: PRIDE-derived BSA runs from github.com/bigbio/quantms-test-datasets (</w:t>
+      </w:r>
+      <w:r>
+        <w:rPr>
+          <w:rStyle w:val="VerbatimChar"/>
+        </w:rPr>
+        <w:t xml:space="preserve">testdata/lfq_ci/BSA</w:t>
+      </w:r>
+      <w:r>
+        <w:t xml:space="preserve">, with SDRF) and MassIVE-KB annotated spectra from github.com/Noble-Lab/casanovo (</w:t>
+      </w:r>
+      <w:r>
+        <w:rPr>
+          <w:rStyle w:val="VerbatimChar"/>
+        </w:rPr>
+        <w:t xml:space="preserve">sample_data/</w:t>
+      </w:r>
+      <w:r>
+        <w:t xml:space="preserve">).</w:t>
+      </w:r>
+    </w:p>
+    <w:bookmarkEnd w:id="61"/>
+    <w:bookmarkStart w:id="62" w:name="funding"/>
     <w:p>
       <w:pPr>
         <w:pStyle w:val="Heading1"/>
@@ -9981,8 +12660,8 @@
         <w:t xml:space="preserve">Not applicable.</w:t>
       </w:r>
     </w:p>
-    <w:bookmarkEnd w:id="57"/>
-    <w:bookmarkStart w:id="58" w:name="conflict-of-interest"/>
+    <w:bookmarkEnd w:id="62"/>
+    <w:bookmarkStart w:id="63" w:name="conflict-of-interest"/>
     <w:p>
       <w:pPr>
         <w:pStyle w:val="Heading1"/>
@@ -10002,8 +12681,8 @@
         <w:t xml:space="preserve">The author declares no competing interests.</w:t>
       </w:r>
     </w:p>
-    <w:bookmarkEnd w:id="58"/>
-    <w:bookmarkStart w:id="59" w:name="author-contributions"/>
+    <w:bookmarkEnd w:id="63"/>
+    <w:bookmarkStart w:id="64" w:name="author-contributions"/>
     <w:p>
       <w:pPr>
         <w:pStyle w:val="Heading1"/>
@@ -10023,8 +12702,8 @@
         <w:t xml:space="preserve">M.N.A.: conceptualisation, methodology, software, investigation, formal analysis, visualisation, writing — original draft, review and editing.</w:t>
       </w:r>
     </w:p>
-    <w:bookmarkEnd w:id="59"/>
-    <w:bookmarkStart w:id="60" w:name="references"/>
+    <w:bookmarkEnd w:id="64"/>
+    <w:bookmarkStart w:id="65" w:name="references"/>
     <w:p>
       <w:pPr>
         <w:pStyle w:val="Heading1"/>
@@ -11132,7 +13811,139 @@
         <w:t xml:space="preserve">2011;12:2825–2830.</w:t>
       </w:r>
     </w:p>
-    <w:bookmarkEnd w:id="60"/>
+    <w:p>
+      <w:pPr>
+        <w:numPr>
+          <w:ilvl w:val="0"/>
+          <w:numId w:val="1006"/>
+        </w:numPr>
+        <w:pStyle w:val="Compact"/>
+      </w:pPr>
+      <w:r>
+        <w:t xml:space="preserve">Dai C, Pfeuffer J, Wang H,</w:t>
+      </w:r>
+      <w:r>
+        <w:t xml:space="preserve"> </w:t>
+      </w:r>
+      <w:r>
+        <w:rPr>
+          <w:iCs/>
+          <w:i/>
+        </w:rPr>
+        <w:t xml:space="preserve">et al.</w:t>
+      </w:r>
+      <w:r>
+        <w:t xml:space="preserve"> </w:t>
+      </w:r>
+      <w:r>
+        <w:t xml:space="preserve">quantms: a cloud-based pipeline for quantitative proteomics enables the reanalysis of public proteomics data.</w:t>
+      </w:r>
+      <w:r>
+        <w:t xml:space="preserve"> </w:t>
+      </w:r>
+      <w:r>
+        <w:rPr>
+          <w:iCs/>
+          <w:i/>
+        </w:rPr>
+        <w:t xml:space="preserve">Nat Methods</w:t>
+      </w:r>
+      <w:r>
+        <w:t xml:space="preserve"> </w:t>
+      </w:r>
+      <w:r>
+        <w:t xml:space="preserve">2024;21:1603–1607. doi:10.1038/s41592-024-02343-1</w:t>
+      </w:r>
+    </w:p>
+    <w:p>
+      <w:pPr>
+        <w:numPr>
+          <w:ilvl w:val="0"/>
+          <w:numId w:val="1006"/>
+        </w:numPr>
+        <w:pStyle w:val="Compact"/>
+      </w:pPr>
+      <w:r>
+        <w:t xml:space="preserve">Dai C, Füllgrabe A, Pfeuffer J,</w:t>
+      </w:r>
+      <w:r>
+        <w:t xml:space="preserve"> </w:t>
+      </w:r>
+      <w:r>
+        <w:rPr>
+          <w:iCs/>
+          <w:i/>
+        </w:rPr>
+        <w:t xml:space="preserve">et al.</w:t>
+      </w:r>
+      <w:r>
+        <w:t xml:space="preserve"> </w:t>
+      </w:r>
+      <w:r>
+        <w:t xml:space="preserve">A proteomics sample metadata representation for multiomics integration and big data analysis.</w:t>
+      </w:r>
+      <w:r>
+        <w:t xml:space="preserve"> </w:t>
+      </w:r>
+      <w:r>
+        <w:rPr>
+          <w:iCs/>
+          <w:i/>
+        </w:rPr>
+        <w:t xml:space="preserve">Nat Commun</w:t>
+      </w:r>
+      <w:r>
+        <w:t xml:space="preserve"> </w:t>
+      </w:r>
+      <w:r>
+        <w:t xml:space="preserve">2021;12:5854. doi:10.1038/s41467-021-26111-3</w:t>
+      </w:r>
+    </w:p>
+    <w:p>
+      <w:pPr>
+        <w:numPr>
+          <w:ilvl w:val="0"/>
+          <w:numId w:val="1006"/>
+        </w:numPr>
+        <w:pStyle w:val="Compact"/>
+      </w:pPr>
+      <w:r>
+        <w:t xml:space="preserve">Cox J, Neuhauser N, Michalski A,</w:t>
+      </w:r>
+      <w:r>
+        <w:t xml:space="preserve"> </w:t>
+      </w:r>
+      <w:r>
+        <w:rPr>
+          <w:iCs/>
+          <w:i/>
+        </w:rPr>
+        <w:t xml:space="preserve">et al.</w:t>
+      </w:r>
+      <w:r>
+        <w:t xml:space="preserve"> </w:t>
+      </w:r>
+      <w:r>
+        <w:t xml:space="preserve">Andromeda: a peptide search engine integrated into the MaxQuant environment.</w:t>
+      </w:r>
+      <w:r>
+        <w:t xml:space="preserve"> </w:t>
+      </w:r>
+      <w:r>
+        <w:rPr>
+          <w:iCs/>
+          <w:i/>
+        </w:rPr>
+        <w:t xml:space="preserve">J Proteome Res</w:t>
+      </w:r>
+      <w:r>
+        <w:t xml:space="preserve"> </w:t>
+      </w:r>
+      <w:r>
+        <w:t xml:space="preserve">2011;10:1794–1805. doi:10.1021/pr101065j</w:t>
+      </w:r>
+    </w:p>
+    <w:bookmarkEnd w:id="65"/>
     <w:sectPr>
       <w:pgMar w:left="1247" w:right="1247" w:top="1134" w:bottom="1134"/>
     </w:sectPr>

</xml_diff>